<commit_message>
Update Experimental Setup report with user device specs (i5-13500, 32GB, RTX 4070)
</commit_message>
<xml_diff>
--- a/reports/Experimental_Setup_MultiGuard.docx
+++ b/reports/Experimental_Setup_MultiGuard.docx
@@ -109,7 +109,7 @@
               <w:rPr>
                 <w:sz w:val="18"/>
               </w:rPr>
-              <w:t>2 × NVIDIA RTX 4090 (24 GB each → 48 GB total VRAM)</w:t>
+              <w:t>NVIDIA GeForce RTX 4070 (12 GB VRAM)</w:t>
             </w:r>
           </w:p>
         </w:tc>
@@ -122,7 +122,7 @@
               <w:rPr>
                 <w:sz w:val="18"/>
               </w:rPr>
-              <w:t>docs/V4_PLAN.md, docs/MULTIGUARD_SETUP.md</w:t>
+              <w:t>user-provided</w:t>
             </w:r>
           </w:p>
         </w:tc>
@@ -150,7 +150,7 @@
               <w:rPr>
                 <w:sz w:val="18"/>
               </w:rPr>
-              <w:t>[fill in your machine's CPU — not recorded in the repo]</w:t>
+              <w:t>Intel Core i5-13500 (14 cores / 20 threads)</w:t>
             </w:r>
           </w:p>
         </w:tc>
@@ -163,7 +163,7 @@
               <w:rPr>
                 <w:sz w:val="18"/>
               </w:rPr>
-              <w:t>—</w:t>
+              <w:t>user-provided</w:t>
             </w:r>
           </w:p>
         </w:tc>
@@ -191,7 +191,7 @@
               <w:rPr>
                 <w:sz w:val="18"/>
               </w:rPr>
-              <w:t>[fill in your machine's system RAM — not recorded in the repo]</w:t>
+              <w:t>32 GB</w:t>
             </w:r>
           </w:p>
         </w:tc>
@@ -204,7 +204,7 @@
               <w:rPr>
                 <w:sz w:val="18"/>
               </w:rPr>
-              <w:t>—</w:t>
+              <w:t>user-provided</w:t>
             </w:r>
           </w:p>
         </w:tc>
@@ -232,7 +232,7 @@
               <w:rPr>
                 <w:sz w:val="18"/>
               </w:rPr>
-              <w:t>~30 GB (code + models + small data); ~155 GB for the full datasets (VisualNews 99 GB, DGM4 21 GB, NewsCLIPpings 21 GB, MMFakeBench 14 GB)</w:t>
+              <w:t>~155 GB for the full datasets (VisualNews 99 GB, DGM4 21 GB, NewsCLIPpings 21 GB, MMFakeBench 14 GB)</w:t>
             </w:r>
           </w:p>
         </w:tc>

</xml_diff>

<commit_message>
Simplify Experimental Setup report to match template structure exactly
</commit_message>
<xml_diff>
--- a/reports/Experimental_Setup_MultiGuard.docx
+++ b/reports/Experimental_Setup_MultiGuard.docx
@@ -7,12 +7,7 @@
         <w:pStyle w:val="Title"/>
       </w:pPr>
       <w:r>
-        <w:t>Experimental Setup — MultiGuard</w:t>
-      </w:r>
-    </w:p>
-    <w:p>
-      <w:r>
-        <w:t>5-class multimodal fake-news detector (V3.1 spec) plus two standalone binary AI-image forensic detectors. All values are taken from the project repository (sources cited per table). Items marked [fill in] are machine-specific and not recorded in the repo.</w:t>
+        <w:t>Experimental Setup</w:t>
       </w:r>
     </w:p>
     <w:p>
@@ -29,6 +24,448 @@
       </w:pPr>
       <w:r>
         <w:t>A. Hardware Environment</w:t>
+      </w:r>
+    </w:p>
+    <w:p>
+      <w:pPr>
+        <w:pStyle w:val="ListBullet"/>
+      </w:pPr>
+      <w:r>
+        <w:rPr>
+          <w:b/>
+        </w:rPr>
+        <w:t xml:space="preserve">GPU: </w:t>
+      </w:r>
+      <w:r>
+        <w:t>NVIDIA GeForce RTX 4070 (12 GB VRAM)</w:t>
+      </w:r>
+    </w:p>
+    <w:p>
+      <w:pPr>
+        <w:pStyle w:val="ListBullet"/>
+      </w:pPr>
+      <w:r>
+        <w:rPr>
+          <w:b/>
+        </w:rPr>
+        <w:t xml:space="preserve">CPU: </w:t>
+      </w:r>
+      <w:r>
+        <w:t>Intel Core i5-13500 (14 cores / 20 threads)</w:t>
+      </w:r>
+    </w:p>
+    <w:p>
+      <w:pPr>
+        <w:pStyle w:val="ListBullet"/>
+      </w:pPr>
+      <w:r>
+        <w:rPr>
+          <w:b/>
+        </w:rPr>
+        <w:t xml:space="preserve">RAM: </w:t>
+      </w:r>
+      <w:r>
+        <w:t>32 GB</w:t>
+      </w:r>
+    </w:p>
+    <w:p>
+      <w:pPr>
+        <w:pStyle w:val="ListBullet"/>
+      </w:pPr>
+      <w:r>
+        <w:rPr>
+          <w:b/>
+        </w:rPr>
+        <w:t xml:space="preserve">Storage: </w:t>
+      </w:r>
+      <w:r>
+        <w:t>~155 GB (full datasets)</w:t>
+      </w:r>
+    </w:p>
+    <w:p>
+      <w:pPr>
+        <w:pStyle w:val="Heading2"/>
+      </w:pPr>
+      <w:r>
+        <w:t>B. Software Stack</w:t>
+      </w:r>
+    </w:p>
+    <w:p>
+      <w:pPr>
+        <w:pStyle w:val="ListBullet"/>
+      </w:pPr>
+      <w:r>
+        <w:rPr>
+          <w:b/>
+        </w:rPr>
+        <w:t xml:space="preserve">Operating System: </w:t>
+      </w:r>
+      <w:r>
+        <w:t>Windows (CUDA 12.4+)</w:t>
+      </w:r>
+    </w:p>
+    <w:p>
+      <w:pPr>
+        <w:pStyle w:val="ListBullet"/>
+      </w:pPr>
+      <w:r>
+        <w:rPr>
+          <w:b/>
+        </w:rPr>
+        <w:t xml:space="preserve">Programming Language: </w:t>
+      </w:r>
+      <w:r>
+        <w:t>Python 3.12</w:t>
+      </w:r>
+    </w:p>
+    <w:p>
+      <w:pPr>
+        <w:pStyle w:val="ListBullet"/>
+      </w:pPr>
+      <w:r>
+        <w:rPr>
+          <w:b/>
+        </w:rPr>
+        <w:t xml:space="preserve">Core Libraries: </w:t>
+      </w:r>
+      <w:r>
+        <w:t>PyTorch + torchvision, Hugging Face Transformers, OpenCV / Pillow, scikit-learn, NumPy, pandas</w:t>
+      </w:r>
+    </w:p>
+    <w:p>
+      <w:pPr>
+        <w:pStyle w:val="Heading2"/>
+      </w:pPr>
+      <w:r>
+        <w:t>C. Model Hyperparameters</w:t>
+      </w:r>
+    </w:p>
+    <w:p>
+      <w:r>
+        <w:rPr>
+          <w:b/>
+        </w:rPr>
+        <w:t>Semantic — FND-CLIP</w:t>
+      </w:r>
+    </w:p>
+    <w:p>
+      <w:pPr>
+        <w:pStyle w:val="ListBullet"/>
+      </w:pPr>
+      <w:r>
+        <w:rPr>
+          <w:b/>
+        </w:rPr>
+        <w:t xml:space="preserve">Backbone: </w:t>
+      </w:r>
+      <w:r>
+        <w:t>ResNet50 + BERT + CLIP (Frozen)</w:t>
+      </w:r>
+    </w:p>
+    <w:p>
+      <w:pPr>
+        <w:pStyle w:val="ListBullet"/>
+      </w:pPr>
+      <w:r>
+        <w:rPr>
+          <w:b/>
+        </w:rPr>
+        <w:t xml:space="preserve">Embedding Dimension: </w:t>
+      </w:r>
+      <w:r>
+        <w:t>512 -&gt; 768</w:t>
+      </w:r>
+    </w:p>
+    <w:p>
+      <w:pPr>
+        <w:pStyle w:val="ListBullet"/>
+      </w:pPr>
+      <w:r>
+        <w:rPr>
+          <w:b/>
+        </w:rPr>
+        <w:t xml:space="preserve">Learning Rate: </w:t>
+      </w:r>
+      <w:r>
+        <w:t>1e-4 (AdamW)</w:t>
+      </w:r>
+    </w:p>
+    <w:p>
+      <w:pPr>
+        <w:pStyle w:val="ListBullet"/>
+      </w:pPr>
+      <w:r>
+        <w:rPr>
+          <w:b/>
+        </w:rPr>
+        <w:t xml:space="preserve">Batch Size: </w:t>
+      </w:r>
+      <w:r>
+        <w:t>32</w:t>
+      </w:r>
+    </w:p>
+    <w:p>
+      <w:pPr>
+        <w:pStyle w:val="ListBullet"/>
+      </w:pPr>
+      <w:r>
+        <w:rPr>
+          <w:b/>
+        </w:rPr>
+        <w:t xml:space="preserve">Dropout Rate: </w:t>
+      </w:r>
+      <w:r>
+        <w:t>-</w:t>
+      </w:r>
+    </w:p>
+    <w:p>
+      <w:r>
+        <w:rPr>
+          <w:b/>
+        </w:rPr>
+        <w:t>Image Forensic — DCT ResNet50</w:t>
+      </w:r>
+    </w:p>
+    <w:p>
+      <w:pPr>
+        <w:pStyle w:val="ListBullet"/>
+      </w:pPr>
+      <w:r>
+        <w:rPr>
+          <w:b/>
+        </w:rPr>
+        <w:t xml:space="preserve">Backbone: </w:t>
+      </w:r>
+      <w:r>
+        <w:t>ResNet50, 1-channel conv (fine-tuned)</w:t>
+      </w:r>
+    </w:p>
+    <w:p>
+      <w:pPr>
+        <w:pStyle w:val="ListBullet"/>
+      </w:pPr>
+      <w:r>
+        <w:rPr>
+          <w:b/>
+        </w:rPr>
+        <w:t xml:space="preserve">Embedding Dimension: </w:t>
+      </w:r>
+      <w:r>
+        <w:t>768</w:t>
+      </w:r>
+    </w:p>
+    <w:p>
+      <w:pPr>
+        <w:pStyle w:val="ListBullet"/>
+      </w:pPr>
+      <w:r>
+        <w:rPr>
+          <w:b/>
+        </w:rPr>
+        <w:t xml:space="preserve">Learning Rate: </w:t>
+      </w:r>
+      <w:r>
+        <w:t>1e-4 -&gt; 1e-5 (AdamW)</w:t>
+      </w:r>
+    </w:p>
+    <w:p>
+      <w:pPr>
+        <w:pStyle w:val="ListBullet"/>
+      </w:pPr>
+      <w:r>
+        <w:rPr>
+          <w:b/>
+        </w:rPr>
+        <w:t xml:space="preserve">Batch Size: </w:t>
+      </w:r>
+      <w:r>
+        <w:t>64</w:t>
+      </w:r>
+    </w:p>
+    <w:p>
+      <w:pPr>
+        <w:pStyle w:val="ListBullet"/>
+      </w:pPr>
+      <w:r>
+        <w:rPr>
+          <w:b/>
+        </w:rPr>
+        <w:t xml:space="preserve">Dropout Rate: </w:t>
+      </w:r>
+      <w:r>
+        <w:t>0.3</w:t>
+      </w:r>
+    </w:p>
+    <w:p>
+      <w:r>
+        <w:rPr>
+          <w:b/>
+        </w:rPr>
+        <w:t>Text Forensic — Qwen2-7B-Instruct</w:t>
+      </w:r>
+    </w:p>
+    <w:p>
+      <w:pPr>
+        <w:pStyle w:val="ListBullet"/>
+      </w:pPr>
+      <w:r>
+        <w:rPr>
+          <w:b/>
+        </w:rPr>
+        <w:t xml:space="preserve">Backbone: </w:t>
+      </w:r>
+      <w:r>
+        <w:t>Qwen2-7B (Frozen) + Linear 3584-&gt;768</w:t>
+      </w:r>
+    </w:p>
+    <w:p>
+      <w:pPr>
+        <w:pStyle w:val="ListBullet"/>
+      </w:pPr>
+      <w:r>
+        <w:rPr>
+          <w:b/>
+        </w:rPr>
+        <w:t xml:space="preserve">Embedding Dimension: </w:t>
+      </w:r>
+      <w:r>
+        <w:t>3584 -&gt; 768</w:t>
+      </w:r>
+    </w:p>
+    <w:p>
+      <w:pPr>
+        <w:pStyle w:val="ListBullet"/>
+      </w:pPr>
+      <w:r>
+        <w:rPr>
+          <w:b/>
+        </w:rPr>
+        <w:t xml:space="preserve">Learning Rate: </w:t>
+      </w:r>
+      <w:r>
+        <w:t>1e-4 (AdamW, projection)</w:t>
+      </w:r>
+    </w:p>
+    <w:p>
+      <w:pPr>
+        <w:pStyle w:val="ListBullet"/>
+      </w:pPr>
+      <w:r>
+        <w:rPr>
+          <w:b/>
+        </w:rPr>
+        <w:t xml:space="preserve">Batch Size: </w:t>
+      </w:r>
+      <w:r>
+        <w:t>64</w:t>
+      </w:r>
+    </w:p>
+    <w:p>
+      <w:pPr>
+        <w:pStyle w:val="ListBullet"/>
+      </w:pPr>
+      <w:r>
+        <w:rPr>
+          <w:b/>
+        </w:rPr>
+        <w:t xml:space="preserve">Dropout Rate: </w:t>
+      </w:r>
+      <w:r>
+        <w:t>-</w:t>
+      </w:r>
+    </w:p>
+    <w:p>
+      <w:r>
+        <w:rPr>
+          <w:b/>
+        </w:rPr>
+        <w:t>Fusion — V3PairwiseFusion + MLP</w:t>
+      </w:r>
+    </w:p>
+    <w:p>
+      <w:pPr>
+        <w:pStyle w:val="ListBullet"/>
+      </w:pPr>
+      <w:r>
+        <w:rPr>
+          <w:b/>
+        </w:rPr>
+        <w:t xml:space="preserve">Backbone: </w:t>
+      </w:r>
+      <w:r>
+        <w:t>Pairwise cross-attention (8 heads) + Conv1d + MLP</w:t>
+      </w:r>
+    </w:p>
+    <w:p>
+      <w:pPr>
+        <w:pStyle w:val="ListBullet"/>
+      </w:pPr>
+      <w:r>
+        <w:rPr>
+          <w:b/>
+        </w:rPr>
+        <w:t xml:space="preserve">Embedding Dimension: </w:t>
+      </w:r>
+      <w:r>
+        <w:t>768 -&gt; 1024 -&gt; 5</w:t>
+      </w:r>
+    </w:p>
+    <w:p>
+      <w:pPr>
+        <w:pStyle w:val="ListBullet"/>
+      </w:pPr>
+      <w:r>
+        <w:rPr>
+          <w:b/>
+        </w:rPr>
+        <w:t xml:space="preserve">Learning Rate: </w:t>
+      </w:r>
+      <w:r>
+        <w:t>1e-4 (AdamW)</w:t>
+      </w:r>
+    </w:p>
+    <w:p>
+      <w:pPr>
+        <w:pStyle w:val="ListBullet"/>
+      </w:pPr>
+      <w:r>
+        <w:rPr>
+          <w:b/>
+        </w:rPr>
+        <w:t xml:space="preserve">Batch Size: </w:t>
+      </w:r>
+      <w:r>
+        <w:t>64</w:t>
+      </w:r>
+    </w:p>
+    <w:p>
+      <w:pPr>
+        <w:pStyle w:val="ListBullet"/>
+      </w:pPr>
+      <w:r>
+        <w:rPr>
+          <w:b/>
+        </w:rPr>
+        <w:t xml:space="preserve">Dropout Rate: </w:t>
+      </w:r>
+      <w:r>
+        <w:t>0.5 (MLP) / 0.1 (attention)</w:t>
+      </w:r>
+    </w:p>
+    <w:p>
+      <w:pPr>
+        <w:pStyle w:val="Heading1"/>
+      </w:pPr>
+      <w:r>
+        <w:t>II. Evaluation Results &amp; Ablation Studies</w:t>
+      </w:r>
+    </w:p>
+    <w:p>
+      <w:pPr>
+        <w:pStyle w:val="Heading2"/>
+      </w:pPr>
+      <w:r>
+        <w:t>a. Ablation studies</w:t>
       </w:r>
     </w:p>
     <w:tbl>
@@ -51,9 +488,8 @@
             <w:r>
               <w:rPr>
                 <w:b/>
-                <w:sz w:val="18"/>
               </w:rPr>
-              <w:t>Item</w:t>
+              <w:t>Variant</w:t>
             </w:r>
           </w:p>
         </w:tc>
@@ -65,9 +501,8 @@
             <w:r>
               <w:rPr>
                 <w:b/>
-                <w:sz w:val="18"/>
               </w:rPr>
-              <w:t>Value</w:t>
+              <w:t>Accuracy</w:t>
             </w:r>
           </w:p>
         </w:tc>
@@ -79,9 +514,8 @@
             <w:r>
               <w:rPr>
                 <w:b/>
-                <w:sz w:val="18"/>
               </w:rPr>
-              <w:t>Source</w:t>
+              <w:t>F1-macro</w:t>
             </w:r>
           </w:p>
         </w:tc>
@@ -93,10 +527,7 @@
           </w:tcPr>
           <w:p>
             <w:r>
-              <w:rPr>
-                <w:sz w:val="18"/>
-              </w:rPr>
-              <w:t>GPU</w:t>
+              <w:t>Semantic only</w:t>
             </w:r>
           </w:p>
         </w:tc>
@@ -106,10 +537,7 @@
           </w:tcPr>
           <w:p>
             <w:r>
-              <w:rPr>
-                <w:sz w:val="18"/>
-              </w:rPr>
-              <w:t>NVIDIA GeForce RTX 4070 (12 GB VRAM)</w:t>
+              <w:t>-</w:t>
             </w:r>
           </w:p>
         </w:tc>
@@ -119,10 +547,7 @@
           </w:tcPr>
           <w:p>
             <w:r>
-              <w:rPr>
-                <w:sz w:val="18"/>
-              </w:rPr>
-              <w:t>user-provided</w:t>
+              <w:t>0.6681</w:t>
             </w:r>
           </w:p>
         </w:tc>
@@ -134,10 +559,7 @@
           </w:tcPr>
           <w:p>
             <w:r>
-              <w:rPr>
-                <w:sz w:val="18"/>
-              </w:rPr>
-              <w:t>CPU</w:t>
+              <w:t>Semantic + Text</w:t>
             </w:r>
           </w:p>
         </w:tc>
@@ -147,10 +569,7 @@
           </w:tcPr>
           <w:p>
             <w:r>
-              <w:rPr>
-                <w:sz w:val="18"/>
-              </w:rPr>
-              <w:t>Intel Core i5-13500 (14 cores / 20 threads)</w:t>
+              <w:t>-</w:t>
             </w:r>
           </w:p>
         </w:tc>
@@ -160,10 +579,7 @@
           </w:tcPr>
           <w:p>
             <w:r>
-              <w:rPr>
-                <w:sz w:val="18"/>
-              </w:rPr>
-              <w:t>user-provided</w:t>
+              <w:t>0.7103</w:t>
             </w:r>
           </w:p>
         </w:tc>
@@ -175,10 +591,7 @@
           </w:tcPr>
           <w:p>
             <w:r>
-              <w:rPr>
-                <w:sz w:val="18"/>
-              </w:rPr>
-              <w:t>RAM (system)</w:t>
+              <w:t>Semantic + Image</w:t>
             </w:r>
           </w:p>
         </w:tc>
@@ -188,10 +601,7 @@
           </w:tcPr>
           <w:p>
             <w:r>
-              <w:rPr>
-                <w:sz w:val="18"/>
-              </w:rPr>
-              <w:t>32 GB</w:t>
+              <w:t>-</w:t>
             </w:r>
           </w:p>
         </w:tc>
@@ -201,10 +611,7 @@
           </w:tcPr>
           <w:p>
             <w:r>
-              <w:rPr>
-                <w:sz w:val="18"/>
-              </w:rPr>
-              <w:t>user-provided</w:t>
+              <w:t>0.6975</w:t>
             </w:r>
           </w:p>
         </w:tc>
@@ -216,10 +623,7 @@
           </w:tcPr>
           <w:p>
             <w:r>
-              <w:rPr>
-                <w:sz w:val="18"/>
-              </w:rPr>
-              <w:t>Storage</w:t>
+              <w:t>All three (full)</w:t>
             </w:r>
           </w:p>
         </w:tc>
@@ -229,10 +633,7 @@
           </w:tcPr>
           <w:p>
             <w:r>
-              <w:rPr>
-                <w:sz w:val="18"/>
-              </w:rPr>
-              <w:t>~155 GB for the full datasets (VisualNews 99 GB, DGM4 21 GB, NewsCLIPpings 21 GB, MMFakeBench 14 GB)</w:t>
+              <w:t>0.7305</w:t>
             </w:r>
           </w:p>
         </w:tc>
@@ -242,51 +643,7 @@
           </w:tcPr>
           <w:p>
             <w:r>
-              <w:rPr>
-                <w:sz w:val="18"/>
-              </w:rPr>
-              <w:t>docs/MULTIGUARD_SETUP.md</w:t>
-            </w:r>
-          </w:p>
-        </w:tc>
-      </w:tr>
-      <w:tr>
-        <w:tc>
-          <w:tcPr>
-            <w:tcW w:type="dxa" w:w="2880"/>
-          </w:tcPr>
-          <w:p>
-            <w:r>
-              <w:rPr>
-                <w:sz w:val="18"/>
-              </w:rPr>
-              <w:t>CUDA</w:t>
-            </w:r>
-          </w:p>
-        </w:tc>
-        <w:tc>
-          <w:tcPr>
-            <w:tcW w:type="dxa" w:w="2880"/>
-          </w:tcPr>
-          <w:p>
-            <w:r>
-              <w:rPr>
-                <w:sz w:val="18"/>
-              </w:rPr>
-              <w:t>12.4+</w:t>
-            </w:r>
-          </w:p>
-        </w:tc>
-        <w:tc>
-          <w:tcPr>
-            <w:tcW w:type="dxa" w:w="2880"/>
-          </w:tcPr>
-          <w:p>
-            <w:r>
-              <w:rPr>
-                <w:sz w:val="18"/>
-              </w:rPr>
-              <w:t>docs/V4_PLAN.md, docs/MULTIGUARD_SETUP.md</w:t>
+              <w:t>0.7149</w:t>
             </w:r>
           </w:p>
         </w:tc>
@@ -298,1444 +655,7 @@
         <w:pStyle w:val="Heading2"/>
       </w:pPr>
       <w:r>
-        <w:t>B. Software Stack</w:t>
-      </w:r>
-    </w:p>
-    <w:tbl>
-      <w:tblPr>
-        <w:tblStyle w:val="LightGrid-Accent1"/>
-        <w:tblW w:type="auto" w:w="0"/>
-        <w:tblLook w:firstColumn="1" w:firstRow="1" w:lastColumn="0" w:lastRow="0" w:noHBand="0" w:noVBand="1" w:val="04A0"/>
-      </w:tblPr>
-      <w:tblGrid>
-        <w:gridCol w:w="2880"/>
-        <w:gridCol w:w="2880"/>
-        <w:gridCol w:w="2880"/>
-      </w:tblGrid>
-      <w:tr>
-        <w:tc>
-          <w:tcPr>
-            <w:tcW w:type="dxa" w:w="2880"/>
-          </w:tcPr>
-          <w:p>
-            <w:r>
-              <w:rPr>
-                <w:b/>
-                <w:sz w:val="18"/>
-              </w:rPr>
-              <w:t>Item</w:t>
-            </w:r>
-          </w:p>
-        </w:tc>
-        <w:tc>
-          <w:tcPr>
-            <w:tcW w:type="dxa" w:w="2880"/>
-          </w:tcPr>
-          <w:p>
-            <w:r>
-              <w:rPr>
-                <w:b/>
-                <w:sz w:val="18"/>
-              </w:rPr>
-              <w:t>Value</w:t>
-            </w:r>
-          </w:p>
-        </w:tc>
-        <w:tc>
-          <w:tcPr>
-            <w:tcW w:type="dxa" w:w="2880"/>
-          </w:tcPr>
-          <w:p>
-            <w:r>
-              <w:rPr>
-                <w:b/>
-                <w:sz w:val="18"/>
-              </w:rPr>
-              <w:t>Source</w:t>
-            </w:r>
-          </w:p>
-        </w:tc>
-      </w:tr>
-      <w:tr>
-        <w:tc>
-          <w:tcPr>
-            <w:tcW w:type="dxa" w:w="2880"/>
-          </w:tcPr>
-          <w:p>
-            <w:r>
-              <w:rPr>
-                <w:sz w:val="18"/>
-              </w:rPr>
-              <w:t>Operating System</w:t>
-            </w:r>
-          </w:p>
-        </w:tc>
-        <w:tc>
-          <w:tcPr>
-            <w:tcW w:type="dxa" w:w="2880"/>
-          </w:tcPr>
-          <w:p>
-            <w:r>
-              <w:rPr>
-                <w:sz w:val="18"/>
-              </w:rPr>
-              <w:t>Windows (development machine)</w:t>
-            </w:r>
-          </w:p>
-        </w:tc>
-        <w:tc>
-          <w:tcPr>
-            <w:tcW w:type="dxa" w:w="2880"/>
-          </w:tcPr>
-          <w:p>
-            <w:r>
-              <w:rPr>
-                <w:sz w:val="18"/>
-              </w:rPr>
-              <w:t>docs/V4_PLAN.md</w:t>
-            </w:r>
-          </w:p>
-        </w:tc>
-      </w:tr>
-      <w:tr>
-        <w:tc>
-          <w:tcPr>
-            <w:tcW w:type="dxa" w:w="2880"/>
-          </w:tcPr>
-          <w:p>
-            <w:r>
-              <w:rPr>
-                <w:sz w:val="18"/>
-              </w:rPr>
-              <w:t>Programming Language</w:t>
-            </w:r>
-          </w:p>
-        </w:tc>
-        <w:tc>
-          <w:tcPr>
-            <w:tcW w:type="dxa" w:w="2880"/>
-          </w:tcPr>
-          <w:p>
-            <w:r>
-              <w:rPr>
-                <w:sz w:val="18"/>
-              </w:rPr>
-              <w:t>Python 3.12</w:t>
-            </w:r>
-          </w:p>
-        </w:tc>
-        <w:tc>
-          <w:tcPr>
-            <w:tcW w:type="dxa" w:w="2880"/>
-          </w:tcPr>
-          <w:p>
-            <w:r>
-              <w:rPr>
-                <w:sz w:val="18"/>
-              </w:rPr>
-              <w:t>pyproject.toml</w:t>
-            </w:r>
-          </w:p>
-        </w:tc>
-      </w:tr>
-      <w:tr>
-        <w:tc>
-          <w:tcPr>
-            <w:tcW w:type="dxa" w:w="2880"/>
-          </w:tcPr>
-          <w:p>
-            <w:r>
-              <w:rPr>
-                <w:sz w:val="18"/>
-              </w:rPr>
-              <w:t>DL Framework</w:t>
-            </w:r>
-          </w:p>
-        </w:tc>
-        <w:tc>
-          <w:tcPr>
-            <w:tcW w:type="dxa" w:w="2880"/>
-          </w:tcPr>
-          <w:p>
-            <w:r>
-              <w:rPr>
-                <w:sz w:val="18"/>
-              </w:rPr>
-              <w:t>PyTorch ≥ 2.6 (CUDA 12.4 build) · torchvision ≥ 0.21</w:t>
-            </w:r>
-          </w:p>
-        </w:tc>
-        <w:tc>
-          <w:tcPr>
-            <w:tcW w:type="dxa" w:w="2880"/>
-          </w:tcPr>
-          <w:p>
-            <w:r>
-              <w:rPr>
-                <w:sz w:val="18"/>
-              </w:rPr>
-              <w:t>pyproject.toml</w:t>
-            </w:r>
-          </w:p>
-        </w:tc>
-      </w:tr>
-      <w:tr>
-        <w:tc>
-          <w:tcPr>
-            <w:tcW w:type="dxa" w:w="2880"/>
-          </w:tcPr>
-          <w:p>
-            <w:r>
-              <w:rPr>
-                <w:sz w:val="18"/>
-              </w:rPr>
-              <w:t>LLM / Transformers</w:t>
-            </w:r>
-          </w:p>
-        </w:tc>
-        <w:tc>
-          <w:tcPr>
-            <w:tcW w:type="dxa" w:w="2880"/>
-          </w:tcPr>
-          <w:p>
-            <w:r>
-              <w:rPr>
-                <w:sz w:val="18"/>
-              </w:rPr>
-              <w:t>Hugging Face Transformers ≥ 4.45, &lt; 5.0 · accelerate ≥ 0.34 · safetensors ≥ 0.4</w:t>
-            </w:r>
-          </w:p>
-        </w:tc>
-        <w:tc>
-          <w:tcPr>
-            <w:tcW w:type="dxa" w:w="2880"/>
-          </w:tcPr>
-          <w:p>
-            <w:r>
-              <w:rPr>
-                <w:sz w:val="18"/>
-              </w:rPr>
-              <w:t>pyproject.toml</w:t>
-            </w:r>
-          </w:p>
-        </w:tc>
-      </w:tr>
-      <w:tr>
-        <w:tc>
-          <w:tcPr>
-            <w:tcW w:type="dxa" w:w="2880"/>
-          </w:tcPr>
-          <w:p>
-            <w:r>
-              <w:rPr>
-                <w:sz w:val="18"/>
-              </w:rPr>
-              <w:t>Image pre-processing</w:t>
-            </w:r>
-          </w:p>
-        </w:tc>
-        <w:tc>
-          <w:tcPr>
-            <w:tcW w:type="dxa" w:w="2880"/>
-          </w:tcPr>
-          <w:p>
-            <w:r>
-              <w:rPr>
-                <w:sz w:val="18"/>
-              </w:rPr>
-              <w:t>OpenCV ≥ 4.9 · Pillow ≥ 10.2</w:t>
-            </w:r>
-          </w:p>
-        </w:tc>
-        <w:tc>
-          <w:tcPr>
-            <w:tcW w:type="dxa" w:w="2880"/>
-          </w:tcPr>
-          <w:p>
-            <w:r>
-              <w:rPr>
-                <w:sz w:val="18"/>
-              </w:rPr>
-              <w:t>pyproject.toml</w:t>
-            </w:r>
-          </w:p>
-        </w:tc>
-      </w:tr>
-      <w:tr>
-        <w:tc>
-          <w:tcPr>
-            <w:tcW w:type="dxa" w:w="2880"/>
-          </w:tcPr>
-          <w:p>
-            <w:r>
-              <w:rPr>
-                <w:sz w:val="18"/>
-              </w:rPr>
-              <w:t>Metrics / ML utils</w:t>
-            </w:r>
-          </w:p>
-        </w:tc>
-        <w:tc>
-          <w:tcPr>
-            <w:tcW w:type="dxa" w:w="2880"/>
-          </w:tcPr>
-          <w:p>
-            <w:r>
-              <w:rPr>
-                <w:sz w:val="18"/>
-              </w:rPr>
-              <w:t>scikit-learn ≥ 1.4</w:t>
-            </w:r>
-          </w:p>
-        </w:tc>
-        <w:tc>
-          <w:tcPr>
-            <w:tcW w:type="dxa" w:w="2880"/>
-          </w:tcPr>
-          <w:p>
-            <w:r>
-              <w:rPr>
-                <w:sz w:val="18"/>
-              </w:rPr>
-              <w:t>pyproject.toml</w:t>
-            </w:r>
-          </w:p>
-        </w:tc>
-      </w:tr>
-      <w:tr>
-        <w:tc>
-          <w:tcPr>
-            <w:tcW w:type="dxa" w:w="2880"/>
-          </w:tcPr>
-          <w:p>
-            <w:r>
-              <w:rPr>
-                <w:sz w:val="18"/>
-              </w:rPr>
-              <w:t>Numerics / data</w:t>
-            </w:r>
-          </w:p>
-        </w:tc>
-        <w:tc>
-          <w:tcPr>
-            <w:tcW w:type="dxa" w:w="2880"/>
-          </w:tcPr>
-          <w:p>
-            <w:r>
-              <w:rPr>
-                <w:sz w:val="18"/>
-              </w:rPr>
-              <w:t>NumPy ≥ 1.26 (&lt; 2.0) · pandas ≥ 2.2</w:t>
-            </w:r>
-          </w:p>
-        </w:tc>
-        <w:tc>
-          <w:tcPr>
-            <w:tcW w:type="dxa" w:w="2880"/>
-          </w:tcPr>
-          <w:p>
-            <w:r>
-              <w:rPr>
-                <w:sz w:val="18"/>
-              </w:rPr>
-              <w:t>pyproject.toml</w:t>
-            </w:r>
-          </w:p>
-        </w:tc>
-      </w:tr>
-    </w:tbl>
-    <w:p/>
-    <w:p>
-      <w:pPr>
-        <w:pStyle w:val="Heading2"/>
-      </w:pPr>
-      <w:r>
-        <w:t>C. Model Hyperparameters</w:t>
-      </w:r>
-    </w:p>
-    <w:tbl>
-      <w:tblPr>
-        <w:tblStyle w:val="LightGrid-Accent1"/>
-        <w:tblW w:type="auto" w:w="0"/>
-        <w:tblLook w:firstColumn="1" w:firstRow="1" w:lastColumn="0" w:lastRow="0" w:noHBand="0" w:noVBand="1" w:val="04A0"/>
-      </w:tblPr>
-      <w:tblGrid>
-        <w:gridCol w:w="785"/>
-        <w:gridCol w:w="785"/>
-        <w:gridCol w:w="785"/>
-        <w:gridCol w:w="785"/>
-        <w:gridCol w:w="785"/>
-        <w:gridCol w:w="785"/>
-        <w:gridCol w:w="785"/>
-        <w:gridCol w:w="785"/>
-        <w:gridCol w:w="785"/>
-        <w:gridCol w:w="785"/>
-        <w:gridCol w:w="785"/>
-      </w:tblGrid>
-      <w:tr>
-        <w:tc>
-          <w:tcPr>
-            <w:tcW w:type="dxa" w:w="785"/>
-          </w:tcPr>
-          <w:p>
-            <w:r>
-              <w:rPr>
-                <w:b/>
-                <w:sz w:val="16"/>
-              </w:rPr>
-              <w:t>Component (stage)</w:t>
-            </w:r>
-          </w:p>
-        </w:tc>
-        <w:tc>
-          <w:tcPr>
-            <w:tcW w:type="dxa" w:w="785"/>
-          </w:tcPr>
-          <w:p>
-            <w:r>
-              <w:rPr>
-                <w:b/>
-                <w:sz w:val="16"/>
-              </w:rPr>
-              <w:t>Backbone</w:t>
-            </w:r>
-          </w:p>
-        </w:tc>
-        <w:tc>
-          <w:tcPr>
-            <w:tcW w:type="dxa" w:w="785"/>
-          </w:tcPr>
-          <w:p>
-            <w:r>
-              <w:rPr>
-                <w:b/>
-                <w:sz w:val="16"/>
-              </w:rPr>
-              <w:t>Frozen?</w:t>
-            </w:r>
-          </w:p>
-        </w:tc>
-        <w:tc>
-          <w:tcPr>
-            <w:tcW w:type="dxa" w:w="785"/>
-          </w:tcPr>
-          <w:p>
-            <w:r>
-              <w:rPr>
-                <w:b/>
-                <w:sz w:val="16"/>
-              </w:rPr>
-              <w:t>Embed dim</w:t>
-            </w:r>
-          </w:p>
-        </w:tc>
-        <w:tc>
-          <w:tcPr>
-            <w:tcW w:type="dxa" w:w="785"/>
-          </w:tcPr>
-          <w:p>
-            <w:r>
-              <w:rPr>
-                <w:b/>
-                <w:sz w:val="16"/>
-              </w:rPr>
-              <w:t>LR</w:t>
-            </w:r>
-          </w:p>
-        </w:tc>
-        <w:tc>
-          <w:tcPr>
-            <w:tcW w:type="dxa" w:w="785"/>
-          </w:tcPr>
-          <w:p>
-            <w:r>
-              <w:rPr>
-                <w:b/>
-                <w:sz w:val="16"/>
-              </w:rPr>
-              <w:t>Optimizer</w:t>
-            </w:r>
-          </w:p>
-        </w:tc>
-        <w:tc>
-          <w:tcPr>
-            <w:tcW w:type="dxa" w:w="785"/>
-          </w:tcPr>
-          <w:p>
-            <w:r>
-              <w:rPr>
-                <w:b/>
-                <w:sz w:val="16"/>
-              </w:rPr>
-              <w:t>Batch</w:t>
-            </w:r>
-          </w:p>
-        </w:tc>
-        <w:tc>
-          <w:tcPr>
-            <w:tcW w:type="dxa" w:w="785"/>
-          </w:tcPr>
-          <w:p>
-            <w:r>
-              <w:rPr>
-                <w:b/>
-                <w:sz w:val="16"/>
-              </w:rPr>
-              <w:t>Epochs</w:t>
-            </w:r>
-          </w:p>
-        </w:tc>
-        <w:tc>
-          <w:tcPr>
-            <w:tcW w:type="dxa" w:w="785"/>
-          </w:tcPr>
-          <w:p>
-            <w:r>
-              <w:rPr>
-                <w:b/>
-                <w:sz w:val="16"/>
-              </w:rPr>
-              <w:t>Dropout</w:t>
-            </w:r>
-          </w:p>
-        </w:tc>
-        <w:tc>
-          <w:tcPr>
-            <w:tcW w:type="dxa" w:w="785"/>
-          </w:tcPr>
-          <w:p>
-            <w:r>
-              <w:rPr>
-                <w:b/>
-                <w:sz w:val="16"/>
-              </w:rPr>
-              <w:t>Scheduler</w:t>
-            </w:r>
-          </w:p>
-        </w:tc>
-        <w:tc>
-          <w:tcPr>
-            <w:tcW w:type="dxa" w:w="785"/>
-          </w:tcPr>
-          <w:p>
-            <w:r>
-              <w:rPr>
-                <w:b/>
-                <w:sz w:val="16"/>
-              </w:rPr>
-              <w:t>Precision</w:t>
-            </w:r>
-          </w:p>
-        </w:tc>
-      </w:tr>
-      <w:tr>
-        <w:tc>
-          <w:tcPr>
-            <w:tcW w:type="dxa" w:w="785"/>
-          </w:tcPr>
-          <w:p>
-            <w:r>
-              <w:rPr>
-                <w:sz w:val="16"/>
-              </w:rPr>
-              <w:t>Semantic — FND-CLIP (Stage 0)</w:t>
-            </w:r>
-          </w:p>
-        </w:tc>
-        <w:tc>
-          <w:tcPr>
-            <w:tcW w:type="dxa" w:w="785"/>
-          </w:tcPr>
-          <w:p>
-            <w:r>
-              <w:rPr>
-                <w:sz w:val="16"/>
-              </w:rPr>
-              <w:t>ResNet50 + BERT-base + CLIP</w:t>
-            </w:r>
-          </w:p>
-        </w:tc>
-        <w:tc>
-          <w:tcPr>
-            <w:tcW w:type="dxa" w:w="785"/>
-          </w:tcPr>
-          <w:p>
-            <w:r>
-              <w:rPr>
-                <w:sz w:val="16"/>
-              </w:rPr>
-              <w:t>Yes (CLIP frozen)</w:t>
-            </w:r>
-          </w:p>
-        </w:tc>
-        <w:tc>
-          <w:tcPr>
-            <w:tcW w:type="dxa" w:w="785"/>
-          </w:tcPr>
-          <w:p>
-            <w:r>
-              <w:rPr>
-                <w:sz w:val="16"/>
-              </w:rPr>
-              <w:t>512 → 768</w:t>
-            </w:r>
-          </w:p>
-        </w:tc>
-        <w:tc>
-          <w:tcPr>
-            <w:tcW w:type="dxa" w:w="785"/>
-          </w:tcPr>
-          <w:p>
-            <w:r>
-              <w:rPr>
-                <w:sz w:val="16"/>
-              </w:rPr>
-              <w:t>1e-4</w:t>
-            </w:r>
-          </w:p>
-        </w:tc>
-        <w:tc>
-          <w:tcPr>
-            <w:tcW w:type="dxa" w:w="785"/>
-          </w:tcPr>
-          <w:p>
-            <w:r>
-              <w:rPr>
-                <w:sz w:val="16"/>
-              </w:rPr>
-              <w:t>AdamW</w:t>
-            </w:r>
-          </w:p>
-        </w:tc>
-        <w:tc>
-          <w:tcPr>
-            <w:tcW w:type="dxa" w:w="785"/>
-          </w:tcPr>
-          <w:p>
-            <w:r>
-              <w:rPr>
-                <w:sz w:val="16"/>
-              </w:rPr>
-              <w:t>32</w:t>
-            </w:r>
-          </w:p>
-        </w:tc>
-        <w:tc>
-          <w:tcPr>
-            <w:tcW w:type="dxa" w:w="785"/>
-          </w:tcPr>
-          <w:p>
-            <w:r>
-              <w:rPr>
-                <w:sz w:val="16"/>
-              </w:rPr>
-              <w:t>20</w:t>
-            </w:r>
-          </w:p>
-        </w:tc>
-        <w:tc>
-          <w:tcPr>
-            <w:tcW w:type="dxa" w:w="785"/>
-          </w:tcPr>
-          <w:p>
-            <w:r>
-              <w:rPr>
-                <w:sz w:val="16"/>
-              </w:rPr>
-              <w:t>—</w:t>
-            </w:r>
-          </w:p>
-        </w:tc>
-        <w:tc>
-          <w:tcPr>
-            <w:tcW w:type="dxa" w:w="785"/>
-          </w:tcPr>
-          <w:p>
-            <w:r>
-              <w:rPr>
-                <w:sz w:val="16"/>
-              </w:rPr>
-              <w:t>StepLR ×0.1 @10</w:t>
-            </w:r>
-          </w:p>
-        </w:tc>
-        <w:tc>
-          <w:tcPr>
-            <w:tcW w:type="dxa" w:w="785"/>
-          </w:tcPr>
-          <w:p>
-            <w:r>
-              <w:rPr>
-                <w:sz w:val="16"/>
-              </w:rPr>
-              <w:t>bf16</w:t>
-            </w:r>
-          </w:p>
-        </w:tc>
-      </w:tr>
-      <w:tr>
-        <w:tc>
-          <w:tcPr>
-            <w:tcW w:type="dxa" w:w="785"/>
-          </w:tcPr>
-          <w:p>
-            <w:r>
-              <w:rPr>
-                <w:sz w:val="16"/>
-              </w:rPr>
-              <w:t>Image forensic — UnivFD (Stage 1)</w:t>
-            </w:r>
-          </w:p>
-        </w:tc>
-        <w:tc>
-          <w:tcPr>
-            <w:tcW w:type="dxa" w:w="785"/>
-          </w:tcPr>
-          <w:p>
-            <w:r>
-              <w:rPr>
-                <w:sz w:val="16"/>
-              </w:rPr>
-              <w:t>ResNet50 (1-ch conv1)</w:t>
-            </w:r>
-          </w:p>
-        </w:tc>
-        <w:tc>
-          <w:tcPr>
-            <w:tcW w:type="dxa" w:w="785"/>
-          </w:tcPr>
-          <w:p>
-            <w:r>
-              <w:rPr>
-                <w:sz w:val="16"/>
-              </w:rPr>
-              <w:t>No (fine-tuned)</w:t>
-            </w:r>
-          </w:p>
-        </w:tc>
-        <w:tc>
-          <w:tcPr>
-            <w:tcW w:type="dxa" w:w="785"/>
-          </w:tcPr>
-          <w:p>
-            <w:r>
-              <w:rPr>
-                <w:sz w:val="16"/>
-              </w:rPr>
-              <w:t>→ 768</w:t>
-            </w:r>
-          </w:p>
-        </w:tc>
-        <w:tc>
-          <w:tcPr>
-            <w:tcW w:type="dxa" w:w="785"/>
-          </w:tcPr>
-          <w:p>
-            <w:r>
-              <w:rPr>
-                <w:sz w:val="16"/>
-              </w:rPr>
-              <w:t>1e-4</w:t>
-            </w:r>
-          </w:p>
-        </w:tc>
-        <w:tc>
-          <w:tcPr>
-            <w:tcW w:type="dxa" w:w="785"/>
-          </w:tcPr>
-          <w:p>
-            <w:r>
-              <w:rPr>
-                <w:sz w:val="16"/>
-              </w:rPr>
-              <w:t>AdamW</w:t>
-            </w:r>
-          </w:p>
-        </w:tc>
-        <w:tc>
-          <w:tcPr>
-            <w:tcW w:type="dxa" w:w="785"/>
-          </w:tcPr>
-          <w:p>
-            <w:r>
-              <w:rPr>
-                <w:sz w:val="16"/>
-              </w:rPr>
-              <w:t>64</w:t>
-            </w:r>
-          </w:p>
-        </w:tc>
-        <w:tc>
-          <w:tcPr>
-            <w:tcW w:type="dxa" w:w="785"/>
-          </w:tcPr>
-          <w:p>
-            <w:r>
-              <w:rPr>
-                <w:sz w:val="16"/>
-              </w:rPr>
-              <w:t>30</w:t>
-            </w:r>
-          </w:p>
-        </w:tc>
-        <w:tc>
-          <w:tcPr>
-            <w:tcW w:type="dxa" w:w="785"/>
-          </w:tcPr>
-          <w:p>
-            <w:r>
-              <w:rPr>
-                <w:sz w:val="16"/>
-              </w:rPr>
-              <w:t>0.3 (head)</w:t>
-            </w:r>
-          </w:p>
-        </w:tc>
-        <w:tc>
-          <w:tcPr>
-            <w:tcW w:type="dxa" w:w="785"/>
-          </w:tcPr>
-          <w:p>
-            <w:r>
-              <w:rPr>
-                <w:sz w:val="16"/>
-              </w:rPr>
-              <w:t>StepLR ×0.1 @20</w:t>
-            </w:r>
-          </w:p>
-        </w:tc>
-        <w:tc>
-          <w:tcPr>
-            <w:tcW w:type="dxa" w:w="785"/>
-          </w:tcPr>
-          <w:p>
-            <w:r>
-              <w:rPr>
-                <w:sz w:val="16"/>
-              </w:rPr>
-              <w:t>bf16</w:t>
-            </w:r>
-          </w:p>
-        </w:tc>
-      </w:tr>
-      <w:tr>
-        <w:tc>
-          <w:tcPr>
-            <w:tcW w:type="dxa" w:w="785"/>
-          </w:tcPr>
-          <w:p>
-            <w:r>
-              <w:rPr>
-                <w:sz w:val="16"/>
-              </w:rPr>
-              <w:t>Image forensic — DCT ResNet50 (detector)</w:t>
-            </w:r>
-          </w:p>
-        </w:tc>
-        <w:tc>
-          <w:tcPr>
-            <w:tcW w:type="dxa" w:w="785"/>
-          </w:tcPr>
-          <w:p>
-            <w:r>
-              <w:rPr>
-                <w:sz w:val="16"/>
-              </w:rPr>
-              <w:t>ResNet50 (1-ch conv1)</w:t>
-            </w:r>
-          </w:p>
-        </w:tc>
-        <w:tc>
-          <w:tcPr>
-            <w:tcW w:type="dxa" w:w="785"/>
-          </w:tcPr>
-          <w:p>
-            <w:r>
-              <w:rPr>
-                <w:sz w:val="16"/>
-              </w:rPr>
-              <w:t>Partial (2-phase)</w:t>
-            </w:r>
-          </w:p>
-        </w:tc>
-        <w:tc>
-          <w:tcPr>
-            <w:tcW w:type="dxa" w:w="785"/>
-          </w:tcPr>
-          <w:p>
-            <w:r>
-              <w:rPr>
-                <w:sz w:val="16"/>
-              </w:rPr>
-              <w:t>→ 768</w:t>
-            </w:r>
-          </w:p>
-        </w:tc>
-        <w:tc>
-          <w:tcPr>
-            <w:tcW w:type="dxa" w:w="785"/>
-          </w:tcPr>
-          <w:p>
-            <w:r>
-              <w:rPr>
-                <w:sz w:val="16"/>
-              </w:rPr>
-              <w:t>1e-4 → 1e-5</w:t>
-            </w:r>
-          </w:p>
-        </w:tc>
-        <w:tc>
-          <w:tcPr>
-            <w:tcW w:type="dxa" w:w="785"/>
-          </w:tcPr>
-          <w:p>
-            <w:r>
-              <w:rPr>
-                <w:sz w:val="16"/>
-              </w:rPr>
-              <w:t>AdamW</w:t>
-            </w:r>
-          </w:p>
-        </w:tc>
-        <w:tc>
-          <w:tcPr>
-            <w:tcW w:type="dxa" w:w="785"/>
-          </w:tcPr>
-          <w:p>
-            <w:r>
-              <w:rPr>
-                <w:sz w:val="16"/>
-              </w:rPr>
-              <w:t>64</w:t>
-            </w:r>
-          </w:p>
-        </w:tc>
-        <w:tc>
-          <w:tcPr>
-            <w:tcW w:type="dxa" w:w="785"/>
-          </w:tcPr>
-          <w:p>
-            <w:r>
-              <w:rPr>
-                <w:sz w:val="16"/>
-              </w:rPr>
-              <w:t>30</w:t>
-            </w:r>
-          </w:p>
-        </w:tc>
-        <w:tc>
-          <w:tcPr>
-            <w:tcW w:type="dxa" w:w="785"/>
-          </w:tcPr>
-          <w:p>
-            <w:r>
-              <w:rPr>
-                <w:sz w:val="16"/>
-              </w:rPr>
-              <w:t>—</w:t>
-            </w:r>
-          </w:p>
-        </w:tc>
-        <w:tc>
-          <w:tcPr>
-            <w:tcW w:type="dxa" w:w="785"/>
-          </w:tcPr>
-          <w:p>
-            <w:r>
-              <w:rPr>
-                <w:sz w:val="16"/>
-              </w:rPr>
-              <w:t>ReduceLROnPlateau</w:t>
-            </w:r>
-          </w:p>
-        </w:tc>
-        <w:tc>
-          <w:tcPr>
-            <w:tcW w:type="dxa" w:w="785"/>
-          </w:tcPr>
-          <w:p>
-            <w:r>
-              <w:rPr>
-                <w:sz w:val="16"/>
-              </w:rPr>
-              <w:t>fp32</w:t>
-            </w:r>
-          </w:p>
-        </w:tc>
-      </w:tr>
-      <w:tr>
-        <w:tc>
-          <w:tcPr>
-            <w:tcW w:type="dxa" w:w="785"/>
-          </w:tcPr>
-          <w:p>
-            <w:r>
-              <w:rPr>
-                <w:sz w:val="16"/>
-              </w:rPr>
-              <w:t>Image forensic — RGB+Fourier (detector)</w:t>
-            </w:r>
-          </w:p>
-        </w:tc>
-        <w:tc>
-          <w:tcPr>
-            <w:tcW w:type="dxa" w:w="785"/>
-          </w:tcPr>
-          <w:p>
-            <w:r>
-              <w:rPr>
-                <w:sz w:val="16"/>
-              </w:rPr>
-              <w:t>ResNet50</w:t>
-            </w:r>
-          </w:p>
-        </w:tc>
-        <w:tc>
-          <w:tcPr>
-            <w:tcW w:type="dxa" w:w="785"/>
-          </w:tcPr>
-          <w:p>
-            <w:r>
-              <w:rPr>
-                <w:sz w:val="16"/>
-              </w:rPr>
-              <w:t>Partial (L1–L2 frozen)</w:t>
-            </w:r>
-          </w:p>
-        </w:tc>
-        <w:tc>
-          <w:tcPr>
-            <w:tcW w:type="dxa" w:w="785"/>
-          </w:tcPr>
-          <w:p>
-            <w:r>
-              <w:rPr>
-                <w:sz w:val="16"/>
-              </w:rPr>
-              <w:t>→ 768</w:t>
-            </w:r>
-          </w:p>
-        </w:tc>
-        <w:tc>
-          <w:tcPr>
-            <w:tcW w:type="dxa" w:w="785"/>
-          </w:tcPr>
-          <w:p>
-            <w:r>
-              <w:rPr>
-                <w:sz w:val="16"/>
-              </w:rPr>
-              <w:t>1e-4</w:t>
-            </w:r>
-          </w:p>
-        </w:tc>
-        <w:tc>
-          <w:tcPr>
-            <w:tcW w:type="dxa" w:w="785"/>
-          </w:tcPr>
-          <w:p>
-            <w:r>
-              <w:rPr>
-                <w:sz w:val="16"/>
-              </w:rPr>
-              <w:t>AdamW</w:t>
-            </w:r>
-          </w:p>
-        </w:tc>
-        <w:tc>
-          <w:tcPr>
-            <w:tcW w:type="dxa" w:w="785"/>
-          </w:tcPr>
-          <w:p>
-            <w:r>
-              <w:rPr>
-                <w:sz w:val="16"/>
-              </w:rPr>
-              <w:t>64</w:t>
-            </w:r>
-          </w:p>
-        </w:tc>
-        <w:tc>
-          <w:tcPr>
-            <w:tcW w:type="dxa" w:w="785"/>
-          </w:tcPr>
-          <w:p>
-            <w:r>
-              <w:rPr>
-                <w:sz w:val="16"/>
-              </w:rPr>
-              <w:t>30</w:t>
-            </w:r>
-          </w:p>
-        </w:tc>
-        <w:tc>
-          <w:tcPr>
-            <w:tcW w:type="dxa" w:w="785"/>
-          </w:tcPr>
-          <w:p>
-            <w:r>
-              <w:rPr>
-                <w:sz w:val="16"/>
-              </w:rPr>
-              <w:t>—</w:t>
-            </w:r>
-          </w:p>
-        </w:tc>
-        <w:tc>
-          <w:tcPr>
-            <w:tcW w:type="dxa" w:w="785"/>
-          </w:tcPr>
-          <w:p>
-            <w:r>
-              <w:rPr>
-                <w:sz w:val="16"/>
-              </w:rPr>
-              <w:t>ReduceLROnPlateau</w:t>
-            </w:r>
-          </w:p>
-        </w:tc>
-        <w:tc>
-          <w:tcPr>
-            <w:tcW w:type="dxa" w:w="785"/>
-          </w:tcPr>
-          <w:p>
-            <w:r>
-              <w:rPr>
-                <w:sz w:val="16"/>
-              </w:rPr>
-              <w:t>fp32</w:t>
-            </w:r>
-          </w:p>
-        </w:tc>
-      </w:tr>
-      <w:tr>
-        <w:tc>
-          <w:tcPr>
-            <w:tcW w:type="dxa" w:w="785"/>
-          </w:tcPr>
-          <w:p>
-            <w:r>
-              <w:rPr>
-                <w:sz w:val="16"/>
-              </w:rPr>
-              <w:t>Text forensic — Qwen2-7B-Instruct</w:t>
-            </w:r>
-          </w:p>
-        </w:tc>
-        <w:tc>
-          <w:tcPr>
-            <w:tcW w:type="dxa" w:w="785"/>
-          </w:tcPr>
-          <w:p>
-            <w:r>
-              <w:rPr>
-                <w:sz w:val="16"/>
-              </w:rPr>
-              <w:t>Qwen2-7B (last layer, masked-mean)</w:t>
-            </w:r>
-          </w:p>
-        </w:tc>
-        <w:tc>
-          <w:tcPr>
-            <w:tcW w:type="dxa" w:w="785"/>
-          </w:tcPr>
-          <w:p>
-            <w:r>
-              <w:rPr>
-                <w:sz w:val="16"/>
-              </w:rPr>
-              <w:t>Yes (frozen)</w:t>
-            </w:r>
-          </w:p>
-        </w:tc>
-        <w:tc>
-          <w:tcPr>
-            <w:tcW w:type="dxa" w:w="785"/>
-          </w:tcPr>
-          <w:p>
-            <w:r>
-              <w:rPr>
-                <w:sz w:val="16"/>
-              </w:rPr>
-              <w:t>3584 → 768</w:t>
-            </w:r>
-          </w:p>
-        </w:tc>
-        <w:tc>
-          <w:tcPr>
-            <w:tcW w:type="dxa" w:w="785"/>
-          </w:tcPr>
-          <w:p>
-            <w:r>
-              <w:rPr>
-                <w:sz w:val="16"/>
-              </w:rPr>
-              <w:t>—</w:t>
-            </w:r>
-          </w:p>
-        </w:tc>
-        <w:tc>
-          <w:tcPr>
-            <w:tcW w:type="dxa" w:w="785"/>
-          </w:tcPr>
-          <w:p>
-            <w:r>
-              <w:rPr>
-                <w:sz w:val="16"/>
-              </w:rPr>
-              <w:t>—</w:t>
-            </w:r>
-          </w:p>
-        </w:tc>
-        <w:tc>
-          <w:tcPr>
-            <w:tcW w:type="dxa" w:w="785"/>
-          </w:tcPr>
-          <w:p>
-            <w:r>
-              <w:rPr>
-                <w:sz w:val="16"/>
-              </w:rPr>
-              <w:t>—</w:t>
-            </w:r>
-          </w:p>
-        </w:tc>
-        <w:tc>
-          <w:tcPr>
-            <w:tcW w:type="dxa" w:w="785"/>
-          </w:tcPr>
-          <w:p>
-            <w:r>
-              <w:rPr>
-                <w:sz w:val="16"/>
-              </w:rPr>
-              <w:t>—</w:t>
-            </w:r>
-          </w:p>
-        </w:tc>
-        <w:tc>
-          <w:tcPr>
-            <w:tcW w:type="dxa" w:w="785"/>
-          </w:tcPr>
-          <w:p>
-            <w:r>
-              <w:rPr>
-                <w:sz w:val="16"/>
-              </w:rPr>
-              <w:t>—</w:t>
-            </w:r>
-          </w:p>
-        </w:tc>
-        <w:tc>
-          <w:tcPr>
-            <w:tcW w:type="dxa" w:w="785"/>
-          </w:tcPr>
-          <w:p>
-            <w:r>
-              <w:rPr>
-                <w:sz w:val="16"/>
-              </w:rPr>
-              <w:t>—</w:t>
-            </w:r>
-          </w:p>
-        </w:tc>
-        <w:tc>
-          <w:tcPr>
-            <w:tcW w:type="dxa" w:w="785"/>
-          </w:tcPr>
-          <w:p>
-            <w:r>
-              <w:rPr>
-                <w:sz w:val="16"/>
-              </w:rPr>
-              <w:t>—</w:t>
-            </w:r>
-          </w:p>
-        </w:tc>
-      </w:tr>
-      <w:tr>
-        <w:tc>
-          <w:tcPr>
-            <w:tcW w:type="dxa" w:w="785"/>
-          </w:tcPr>
-          <w:p>
-            <w:r>
-              <w:rPr>
-                <w:sz w:val="16"/>
-              </w:rPr>
-              <w:t>Fusion — V3PairwiseFusion (Stage 2)</w:t>
-            </w:r>
-          </w:p>
-        </w:tc>
-        <w:tc>
-          <w:tcPr>
-            <w:tcW w:type="dxa" w:w="785"/>
-          </w:tcPr>
-          <w:p>
-            <w:r>
-              <w:rPr>
-                <w:sz w:val="16"/>
-              </w:rPr>
-              <w:t>3-pair cross-attn (8 heads) + Conv1d</w:t>
-            </w:r>
-          </w:p>
-        </w:tc>
-        <w:tc>
-          <w:tcPr>
-            <w:tcW w:type="dxa" w:w="785"/>
-          </w:tcPr>
-          <w:p>
-            <w:r>
-              <w:rPr>
-                <w:sz w:val="16"/>
-              </w:rPr>
-              <w:t>trained</w:t>
-            </w:r>
-          </w:p>
-        </w:tc>
-        <w:tc>
-          <w:tcPr>
-            <w:tcW w:type="dxa" w:w="785"/>
-          </w:tcPr>
-          <w:p>
-            <w:r>
-              <w:rPr>
-                <w:sz w:val="16"/>
-              </w:rPr>
-              <w:t>768 → 1024</w:t>
-            </w:r>
-          </w:p>
-        </w:tc>
-        <w:tc>
-          <w:tcPr>
-            <w:tcW w:type="dxa" w:w="785"/>
-          </w:tcPr>
-          <w:p>
-            <w:r>
-              <w:rPr>
-                <w:sz w:val="16"/>
-              </w:rPr>
-              <w:t>1e-4</w:t>
-            </w:r>
-          </w:p>
-        </w:tc>
-        <w:tc>
-          <w:tcPr>
-            <w:tcW w:type="dxa" w:w="785"/>
-          </w:tcPr>
-          <w:p>
-            <w:r>
-              <w:rPr>
-                <w:sz w:val="16"/>
-              </w:rPr>
-              <w:t>AdamW</w:t>
-            </w:r>
-          </w:p>
-        </w:tc>
-        <w:tc>
-          <w:tcPr>
-            <w:tcW w:type="dxa" w:w="785"/>
-          </w:tcPr>
-          <w:p>
-            <w:r>
-              <w:rPr>
-                <w:sz w:val="16"/>
-              </w:rPr>
-              <w:t>64</w:t>
-            </w:r>
-          </w:p>
-        </w:tc>
-        <w:tc>
-          <w:tcPr>
-            <w:tcW w:type="dxa" w:w="785"/>
-          </w:tcPr>
-          <w:p>
-            <w:r>
-              <w:rPr>
-                <w:sz w:val="16"/>
-              </w:rPr>
-              <w:t>50</w:t>
-            </w:r>
-          </w:p>
-        </w:tc>
-        <w:tc>
-          <w:tcPr>
-            <w:tcW w:type="dxa" w:w="785"/>
-          </w:tcPr>
-          <w:p>
-            <w:r>
-              <w:rPr>
-                <w:sz w:val="16"/>
-              </w:rPr>
-              <w:t>0.5 (MLP) / 0.1 (attn)</w:t>
-            </w:r>
-          </w:p>
-        </w:tc>
-        <w:tc>
-          <w:tcPr>
-            <w:tcW w:type="dxa" w:w="785"/>
-          </w:tcPr>
-          <w:p>
-            <w:r>
-              <w:rPr>
-                <w:sz w:val="16"/>
-              </w:rPr>
-              <w:t>StepLR ×0.1 @30</w:t>
-            </w:r>
-          </w:p>
-        </w:tc>
-        <w:tc>
-          <w:tcPr>
-            <w:tcW w:type="dxa" w:w="785"/>
-          </w:tcPr>
-          <w:p>
-            <w:r>
-              <w:rPr>
-                <w:sz w:val="16"/>
-              </w:rPr>
-              <w:t>bf16</w:t>
-            </w:r>
-          </w:p>
-        </w:tc>
-      </w:tr>
-    </w:tbl>
-    <w:p/>
-    <w:p>
-      <w:r>
-        <w:rPr>
-          <w:i/>
-          <w:sz w:val="18"/>
-        </w:rPr>
-        <w:t>Common: weight decay = 1e-4, gradient clipping max-norm = 1.0, early stopping (patience 5–10 on val AUC/F1). Loss (Stage 2): CrossEntropy (5-class) + 0.1 × BCEWithLogits auxiliary head on detached v_imgfor. Source: phases/v4/configs/*.yaml, phases/v4/src/v4/training/{trainer,losses,schedulers}.py.</w:t>
-      </w:r>
-    </w:p>
-    <w:p>
-      <w:pPr>
-        <w:pStyle w:val="Heading1"/>
-      </w:pPr>
-      <w:r>
-        <w:t>II. Evaluation Results &amp; Ablation Studies</w:t>
-      </w:r>
-    </w:p>
-    <w:p>
-      <w:r>
-        <w:rPr>
-          <w:i/>
-        </w:rPr>
-        <w:t>Final 5-class model = deployed 3-seed honest ensemble (seeds 42 / 1337 / 2024, softmax-averaged). Test split = 2,475 held-out samples, 495 per class.</w:t>
-      </w:r>
-    </w:p>
-    <w:p>
-      <w:pPr>
-        <w:pStyle w:val="Heading2"/>
-      </w:pPr>
-      <w:r>
-        <w:t>Result R1 — 5-Class Classification Report (final model)</w:t>
-      </w:r>
-    </w:p>
-    <w:p>
-      <w:r>
-        <w:t>Source: docs/MODEL_REPORT.md §3.</w:t>
+        <w:t>b. Classification report</w:t>
       </w:r>
     </w:p>
     <w:tbl>
@@ -1760,7 +680,6 @@
             <w:r>
               <w:rPr>
                 <w:b/>
-                <w:sz w:val="18"/>
               </w:rPr>
               <w:t>Class</w:t>
             </w:r>
@@ -1774,7 +693,6 @@
             <w:r>
               <w:rPr>
                 <w:b/>
-                <w:sz w:val="18"/>
               </w:rPr>
               <w:t>Precision</w:t>
             </w:r>
@@ -1788,7 +706,6 @@
             <w:r>
               <w:rPr>
                 <w:b/>
-                <w:sz w:val="18"/>
               </w:rPr>
               <w:t>Recall</w:t>
             </w:r>
@@ -1802,7 +719,6 @@
             <w:r>
               <w:rPr>
                 <w:b/>
-                <w:sz w:val="18"/>
               </w:rPr>
               <w:t>F1</w:t>
             </w:r>
@@ -1816,7 +732,6 @@
             <w:r>
               <w:rPr>
                 <w:b/>
-                <w:sz w:val="18"/>
               </w:rPr>
               <w:t>Support</w:t>
             </w:r>
@@ -1830,10 +745,7 @@
           </w:tcPr>
           <w:p>
             <w:r>
-              <w:rPr>
-                <w:sz w:val="18"/>
-              </w:rPr>
-              <w:t>0 Real</w:t>
+              <w:t>Real</w:t>
             </w:r>
           </w:p>
         </w:tc>
@@ -1843,9 +755,6 @@
           </w:tcPr>
           <w:p>
             <w:r>
-              <w:rPr>
-                <w:sz w:val="18"/>
-              </w:rPr>
               <w:t>0.428</w:t>
             </w:r>
           </w:p>
@@ -1856,9 +765,6 @@
           </w:tcPr>
           <w:p>
             <w:r>
-              <w:rPr>
-                <w:sz w:val="18"/>
-              </w:rPr>
               <w:t>0.370</w:t>
             </w:r>
           </w:p>
@@ -1869,9 +775,6 @@
           </w:tcPr>
           <w:p>
             <w:r>
-              <w:rPr>
-                <w:sz w:val="18"/>
-              </w:rPr>
               <w:t>0.397</w:t>
             </w:r>
           </w:p>
@@ -1882,9 +785,6 @@
           </w:tcPr>
           <w:p>
             <w:r>
-              <w:rPr>
-                <w:sz w:val="18"/>
-              </w:rPr>
               <w:t>495</w:t>
             </w:r>
           </w:p>
@@ -1897,10 +797,7 @@
           </w:tcPr>
           <w:p>
             <w:r>
-              <w:rPr>
-                <w:sz w:val="18"/>
-              </w:rPr>
-              <w:t>1 Out-of-Context</w:t>
+              <w:t>Out-of-Context</w:t>
             </w:r>
           </w:p>
         </w:tc>
@@ -1910,9 +807,6 @@
           </w:tcPr>
           <w:p>
             <w:r>
-              <w:rPr>
-                <w:sz w:val="18"/>
-              </w:rPr>
               <w:t>0.447</w:t>
             </w:r>
           </w:p>
@@ -1923,9 +817,6 @@
           </w:tcPr>
           <w:p>
             <w:r>
-              <w:rPr>
-                <w:sz w:val="18"/>
-              </w:rPr>
               <w:t>0.438</w:t>
             </w:r>
           </w:p>
@@ -1936,9 +827,6 @@
           </w:tcPr>
           <w:p>
             <w:r>
-              <w:rPr>
-                <w:sz w:val="18"/>
-              </w:rPr>
               <w:t>0.442</w:t>
             </w:r>
           </w:p>
@@ -1949,9 +837,6 @@
           </w:tcPr>
           <w:p>
             <w:r>
-              <w:rPr>
-                <w:sz w:val="18"/>
-              </w:rPr>
               <w:t>495</w:t>
             </w:r>
           </w:p>
@@ -1964,10 +849,7 @@
           </w:tcPr>
           <w:p>
             <w:r>
-              <w:rPr>
-                <w:sz w:val="18"/>
-              </w:rPr>
-              <w:t>2 Manipulated</w:t>
+              <w:t>Manipulated</w:t>
             </w:r>
           </w:p>
         </w:tc>
@@ -1977,9 +859,6 @@
           </w:tcPr>
           <w:p>
             <w:r>
-              <w:rPr>
-                <w:sz w:val="18"/>
-              </w:rPr>
               <w:t>0.707</w:t>
             </w:r>
           </w:p>
@@ -1990,9 +869,6 @@
           </w:tcPr>
           <w:p>
             <w:r>
-              <w:rPr>
-                <w:sz w:val="18"/>
-              </w:rPr>
               <w:t>0.814</w:t>
             </w:r>
           </w:p>
@@ -2003,9 +879,6 @@
           </w:tcPr>
           <w:p>
             <w:r>
-              <w:rPr>
-                <w:sz w:val="18"/>
-              </w:rPr>
               <w:t>0.757</w:t>
             </w:r>
           </w:p>
@@ -2016,9 +889,6 @@
           </w:tcPr>
           <w:p>
             <w:r>
-              <w:rPr>
-                <w:sz w:val="18"/>
-              </w:rPr>
               <w:t>495</w:t>
             </w:r>
           </w:p>
@@ -2031,10 +901,7 @@
           </w:tcPr>
           <w:p>
             <w:r>
-              <w:rPr>
-                <w:sz w:val="18"/>
-              </w:rPr>
-              <w:t>3 AI-Text</w:t>
+              <w:t>AI-Text</w:t>
             </w:r>
           </w:p>
         </w:tc>
@@ -2044,9 +911,6 @@
           </w:tcPr>
           <w:p>
             <w:r>
-              <w:rPr>
-                <w:sz w:val="18"/>
-              </w:rPr>
               <w:t>0.984</w:t>
             </w:r>
           </w:p>
@@ -2057,9 +921,6 @@
           </w:tcPr>
           <w:p>
             <w:r>
-              <w:rPr>
-                <w:sz w:val="18"/>
-              </w:rPr>
               <w:t>0.994</w:t>
             </w:r>
           </w:p>
@@ -2070,9 +931,6 @@
           </w:tcPr>
           <w:p>
             <w:r>
-              <w:rPr>
-                <w:sz w:val="18"/>
-              </w:rPr>
               <w:t>0.989</w:t>
             </w:r>
           </w:p>
@@ -2083,9 +941,6 @@
           </w:tcPr>
           <w:p>
             <w:r>
-              <w:rPr>
-                <w:sz w:val="18"/>
-              </w:rPr>
               <w:t>495</w:t>
             </w:r>
           </w:p>
@@ -2098,10 +953,7 @@
           </w:tcPr>
           <w:p>
             <w:r>
-              <w:rPr>
-                <w:sz w:val="18"/>
-              </w:rPr>
-              <w:t>4 Fully-Fabricated</w:t>
+              <w:t>Fully-Fabricated</w:t>
             </w:r>
           </w:p>
         </w:tc>
@@ -2111,9 +963,6 @@
           </w:tcPr>
           <w:p>
             <w:r>
-              <w:rPr>
-                <w:sz w:val="18"/>
-              </w:rPr>
               <w:t>0.994</w:t>
             </w:r>
           </w:p>
@@ -2124,9 +973,6 @@
           </w:tcPr>
           <w:p>
             <w:r>
-              <w:rPr>
-                <w:sz w:val="18"/>
-              </w:rPr>
               <w:t>0.986</w:t>
             </w:r>
           </w:p>
@@ -2137,9 +983,6 @@
           </w:tcPr>
           <w:p>
             <w:r>
-              <w:rPr>
-                <w:sz w:val="18"/>
-              </w:rPr>
               <w:t>0.990</w:t>
             </w:r>
           </w:p>
@@ -2150,9 +993,6 @@
           </w:tcPr>
           <w:p>
             <w:r>
-              <w:rPr>
-                <w:sz w:val="18"/>
-              </w:rPr>
               <w:t>495</w:t>
             </w:r>
           </w:p>
@@ -2165,10 +1005,33 @@
           </w:tcPr>
           <w:p>
             <w:r>
-              <w:rPr>
-                <w:sz w:val="18"/>
-              </w:rPr>
-              <w:t>F1-macro (overall)</w:t>
+              <w:t>accuracy</w:t>
+            </w:r>
+          </w:p>
+        </w:tc>
+        <w:tc>
+          <w:tcPr>
+            <w:tcW w:type="dxa" w:w="1728"/>
+          </w:tcPr>
+          <w:p>
+            <w:r/>
+          </w:p>
+        </w:tc>
+        <w:tc>
+          <w:tcPr>
+            <w:tcW w:type="dxa" w:w="1728"/>
+          </w:tcPr>
+          <w:p>
+            <w:r/>
+          </w:p>
+        </w:tc>
+        <w:tc>
+          <w:tcPr>
+            <w:tcW w:type="dxa" w:w="1728"/>
+          </w:tcPr>
+          <w:p>
+            <w:r>
+              <w:t>0.7305</w:t>
             </w:r>
           </w:p>
         </w:tc>
@@ -2178,10 +1041,19 @@
           </w:tcPr>
           <w:p>
             <w:r>
-              <w:rPr>
-                <w:sz w:val="18"/>
-              </w:rPr>
-              <w:t>—</w:t>
+              <w:t>2475</w:t>
+            </w:r>
+          </w:p>
+        </w:tc>
+      </w:tr>
+      <w:tr>
+        <w:tc>
+          <w:tcPr>
+            <w:tcW w:type="dxa" w:w="1728"/>
+          </w:tcPr>
+          <w:p>
+            <w:r>
+              <w:t>macro avg</w:t>
             </w:r>
           </w:p>
         </w:tc>
@@ -2191,10 +1063,7 @@
           </w:tcPr>
           <w:p>
             <w:r>
-              <w:rPr>
-                <w:sz w:val="18"/>
-              </w:rPr>
-              <w:t>—</w:t>
+              <w:t>0.726</w:t>
             </w:r>
           </w:p>
         </w:tc>
@@ -2204,9 +1073,16 @@
           </w:tcPr>
           <w:p>
             <w:r>
-              <w:rPr>
-                <w:sz w:val="18"/>
-              </w:rPr>
+              <w:t>0.731</w:t>
+            </w:r>
+          </w:p>
+        </w:tc>
+        <w:tc>
+          <w:tcPr>
+            <w:tcW w:type="dxa" w:w="1728"/>
+          </w:tcPr>
+          <w:p>
+            <w:r>
               <w:t>0.7149</w:t>
             </w:r>
           </w:p>
@@ -2217,10 +1093,7 @@
           </w:tcPr>
           <w:p>
             <w:r>
-              <w:rPr>
-                <w:sz w:val="18"/>
-              </w:rPr>
-              <w:t>2,475</w:t>
+              <w:t>2475</w:t>
             </w:r>
           </w:p>
         </w:tc>
@@ -2232,12 +1105,7 @@
         <w:pStyle w:val="Heading2"/>
       </w:pPr>
       <w:r>
-        <w:t>Result R2 — 5-Class Confusion Matrix (final model)</w:t>
-      </w:r>
-    </w:p>
-    <w:p>
-      <w:r>
-        <w:t>Source: docs/MODEL_REPORT.md §3. Rows = true, columns = predicted.</w:t>
+        <w:t>Confusion matrix</w:t>
       </w:r>
     </w:p>
     <w:tbl>
@@ -2263,7 +1131,6 @@
             <w:r>
               <w:rPr>
                 <w:b/>
-                <w:sz w:val="18"/>
               </w:rPr>
               <w:t>true \ pred</w:t>
             </w:r>
@@ -2277,7 +1144,6 @@
             <w:r>
               <w:rPr>
                 <w:b/>
-                <w:sz w:val="18"/>
               </w:rPr>
               <w:t>Real</w:t>
             </w:r>
@@ -2291,7 +1157,6 @@
             <w:r>
               <w:rPr>
                 <w:b/>
-                <w:sz w:val="18"/>
               </w:rPr>
               <w:t>OOC</w:t>
             </w:r>
@@ -2305,7 +1170,6 @@
             <w:r>
               <w:rPr>
                 <w:b/>
-                <w:sz w:val="18"/>
               </w:rPr>
               <w:t>Manip</w:t>
             </w:r>
@@ -2319,7 +1183,6 @@
             <w:r>
               <w:rPr>
                 <w:b/>
-                <w:sz w:val="18"/>
               </w:rPr>
               <w:t>AI-Text</w:t>
             </w:r>
@@ -2333,7 +1196,6 @@
             <w:r>
               <w:rPr>
                 <w:b/>
-                <w:sz w:val="18"/>
               </w:rPr>
               <w:t>Fab</w:t>
             </w:r>
@@ -2347,9 +1209,6 @@
           </w:tcPr>
           <w:p>
             <w:r>
-              <w:rPr>
-                <w:sz w:val="18"/>
-              </w:rPr>
               <w:t>Real</w:t>
             </w:r>
           </w:p>
@@ -2360,9 +1219,6 @@
           </w:tcPr>
           <w:p>
             <w:r>
-              <w:rPr>
-                <w:sz w:val="18"/>
-              </w:rPr>
               <w:t>183</w:t>
             </w:r>
           </w:p>
@@ -2373,9 +1229,6 @@
           </w:tcPr>
           <w:p>
             <w:r>
-              <w:rPr>
-                <w:sz w:val="18"/>
-              </w:rPr>
               <w:t>227</w:t>
             </w:r>
           </w:p>
@@ -2386,9 +1239,6 @@
           </w:tcPr>
           <w:p>
             <w:r>
-              <w:rPr>
-                <w:sz w:val="18"/>
-              </w:rPr>
               <w:t>85</w:t>
             </w:r>
           </w:p>
@@ -2399,9 +1249,6 @@
           </w:tcPr>
           <w:p>
             <w:r>
-              <w:rPr>
-                <w:sz w:val="18"/>
-              </w:rPr>
               <w:t>0</w:t>
             </w:r>
           </w:p>
@@ -2412,9 +1259,6 @@
           </w:tcPr>
           <w:p>
             <w:r>
-              <w:rPr>
-                <w:sz w:val="18"/>
-              </w:rPr>
               <w:t>0</w:t>
             </w:r>
           </w:p>
@@ -2427,9 +1271,6 @@
           </w:tcPr>
           <w:p>
             <w:r>
-              <w:rPr>
-                <w:sz w:val="18"/>
-              </w:rPr>
               <w:t>Out-of-Context</w:t>
             </w:r>
           </w:p>
@@ -2440,9 +1281,6 @@
           </w:tcPr>
           <w:p>
             <w:r>
-              <w:rPr>
-                <w:sz w:val="18"/>
-              </w:rPr>
               <w:t>196</w:t>
             </w:r>
           </w:p>
@@ -2453,9 +1291,6 @@
           </w:tcPr>
           <w:p>
             <w:r>
-              <w:rPr>
-                <w:sz w:val="18"/>
-              </w:rPr>
               <w:t>217</w:t>
             </w:r>
           </w:p>
@@ -2466,9 +1301,6 @@
           </w:tcPr>
           <w:p>
             <w:r>
-              <w:rPr>
-                <w:sz w:val="18"/>
-              </w:rPr>
               <w:t>82</w:t>
             </w:r>
           </w:p>
@@ -2479,9 +1311,6 @@
           </w:tcPr>
           <w:p>
             <w:r>
-              <w:rPr>
-                <w:sz w:val="18"/>
-              </w:rPr>
               <w:t>0</w:t>
             </w:r>
           </w:p>
@@ -2492,9 +1321,6 @@
           </w:tcPr>
           <w:p>
             <w:r>
-              <w:rPr>
-                <w:sz w:val="18"/>
-              </w:rPr>
               <w:t>0</w:t>
             </w:r>
           </w:p>
@@ -2507,9 +1333,6 @@
           </w:tcPr>
           <w:p>
             <w:r>
-              <w:rPr>
-                <w:sz w:val="18"/>
-              </w:rPr>
               <w:t>Manipulated</w:t>
             </w:r>
           </w:p>
@@ -2520,9 +1343,6 @@
           </w:tcPr>
           <w:p>
             <w:r>
-              <w:rPr>
-                <w:sz w:val="18"/>
-              </w:rPr>
               <w:t>49</w:t>
             </w:r>
           </w:p>
@@ -2533,9 +1353,6 @@
           </w:tcPr>
           <w:p>
             <w:r>
-              <w:rPr>
-                <w:sz w:val="18"/>
-              </w:rPr>
               <w:t>42</w:t>
             </w:r>
           </w:p>
@@ -2546,9 +1363,6 @@
           </w:tcPr>
           <w:p>
             <w:r>
-              <w:rPr>
-                <w:sz w:val="18"/>
-              </w:rPr>
               <w:t>403</w:t>
             </w:r>
           </w:p>
@@ -2559,9 +1373,6 @@
           </w:tcPr>
           <w:p>
             <w:r>
-              <w:rPr>
-                <w:sz w:val="18"/>
-              </w:rPr>
               <w:t>1</w:t>
             </w:r>
           </w:p>
@@ -2572,9 +1383,6 @@
           </w:tcPr>
           <w:p>
             <w:r>
-              <w:rPr>
-                <w:sz w:val="18"/>
-              </w:rPr>
               <w:t>0</w:t>
             </w:r>
           </w:p>
@@ -2587,9 +1395,6 @@
           </w:tcPr>
           <w:p>
             <w:r>
-              <w:rPr>
-                <w:sz w:val="18"/>
-              </w:rPr>
               <w:t>AI-Text</w:t>
             </w:r>
           </w:p>
@@ -2600,9 +1405,6 @@
           </w:tcPr>
           <w:p>
             <w:r>
-              <w:rPr>
-                <w:sz w:val="18"/>
-              </w:rPr>
               <w:t>0</w:t>
             </w:r>
           </w:p>
@@ -2613,9 +1415,6 @@
           </w:tcPr>
           <w:p>
             <w:r>
-              <w:rPr>
-                <w:sz w:val="18"/>
-              </w:rPr>
               <w:t>0</w:t>
             </w:r>
           </w:p>
@@ -2626,9 +1425,6 @@
           </w:tcPr>
           <w:p>
             <w:r>
-              <w:rPr>
-                <w:sz w:val="18"/>
-              </w:rPr>
               <w:t>0</w:t>
             </w:r>
           </w:p>
@@ -2639,9 +1435,6 @@
           </w:tcPr>
           <w:p>
             <w:r>
-              <w:rPr>
-                <w:sz w:val="18"/>
-              </w:rPr>
               <w:t>492</w:t>
             </w:r>
           </w:p>
@@ -2652,9 +1445,6 @@
           </w:tcPr>
           <w:p>
             <w:r>
-              <w:rPr>
-                <w:sz w:val="18"/>
-              </w:rPr>
               <w:t>3</w:t>
             </w:r>
           </w:p>
@@ -2667,9 +1457,6 @@
           </w:tcPr>
           <w:p>
             <w:r>
-              <w:rPr>
-                <w:sz w:val="18"/>
-              </w:rPr>
               <w:t>Fully-Fabricated</w:t>
             </w:r>
           </w:p>
@@ -2680,9 +1467,6 @@
           </w:tcPr>
           <w:p>
             <w:r>
-              <w:rPr>
-                <w:sz w:val="18"/>
-              </w:rPr>
               <w:t>0</w:t>
             </w:r>
           </w:p>
@@ -2693,9 +1477,6 @@
           </w:tcPr>
           <w:p>
             <w:r>
-              <w:rPr>
-                <w:sz w:val="18"/>
-              </w:rPr>
               <w:t>0</w:t>
             </w:r>
           </w:p>
@@ -2706,9 +1487,6 @@
           </w:tcPr>
           <w:p>
             <w:r>
-              <w:rPr>
-                <w:sz w:val="18"/>
-              </w:rPr>
               <w:t>0</w:t>
             </w:r>
           </w:p>
@@ -2719,9 +1497,6 @@
           </w:tcPr>
           <w:p>
             <w:r>
-              <w:rPr>
-                <w:sz w:val="18"/>
-              </w:rPr>
               <w:t>7</w:t>
             </w:r>
           </w:p>
@@ -2732,9 +1507,6 @@
           </w:tcPr>
           <w:p>
             <w:r>
-              <w:rPr>
-                <w:sz w:val="18"/>
-              </w:rPr>
               <w:t>488</w:t>
             </w:r>
           </w:p>
@@ -2776,1859 +1548,6 @@
             </a:graphic>
           </wp:inline>
         </w:drawing>
-      </w:r>
-    </w:p>
-    <w:p>
-      <w:pPr>
-        <w:pStyle w:val="Heading2"/>
-      </w:pPr>
-      <w:r>
-        <w:t>Result R3 — Ablation A: Training-time Branch Contribution</w:t>
-      </w:r>
-    </w:p>
-    <w:p>
-      <w:r>
-        <w:t>Each variant trained from scratch with only the listed branches. Source: docs/IMAGE_BRANCH_ABLATION.md.</w:t>
-      </w:r>
-    </w:p>
-    <w:tbl>
-      <w:tblPr>
-        <w:tblStyle w:val="LightGrid-Accent1"/>
-        <w:tblW w:type="auto" w:w="0"/>
-        <w:tblLook w:firstColumn="1" w:firstRow="1" w:lastColumn="0" w:lastRow="0" w:noHBand="0" w:noVBand="1" w:val="04A0"/>
-      </w:tblPr>
-      <w:tblGrid>
-        <w:gridCol w:w="1234"/>
-        <w:gridCol w:w="1234"/>
-        <w:gridCol w:w="1234"/>
-        <w:gridCol w:w="1234"/>
-        <w:gridCol w:w="1234"/>
-        <w:gridCol w:w="1234"/>
-        <w:gridCol w:w="1234"/>
-      </w:tblGrid>
-      <w:tr>
-        <w:tc>
-          <w:tcPr>
-            <w:tcW w:type="dxa" w:w="1234"/>
-          </w:tcPr>
-          <w:p>
-            <w:r>
-              <w:rPr>
-                <w:b/>
-                <w:sz w:val="16"/>
-              </w:rPr>
-              <w:t>Variant</w:t>
-            </w:r>
-          </w:p>
-        </w:tc>
-        <w:tc>
-          <w:tcPr>
-            <w:tcW w:type="dxa" w:w="1234"/>
-          </w:tcPr>
-          <w:p>
-            <w:r>
-              <w:rPr>
-                <w:b/>
-                <w:sz w:val="16"/>
-              </w:rPr>
-              <w:t>Test F1</w:t>
-            </w:r>
-          </w:p>
-        </w:tc>
-        <w:tc>
-          <w:tcPr>
-            <w:tcW w:type="dxa" w:w="1234"/>
-          </w:tcPr>
-          <w:p>
-            <w:r>
-              <w:rPr>
-                <w:b/>
-                <w:sz w:val="16"/>
-              </w:rPr>
-              <w:t>C0 Real</w:t>
-            </w:r>
-          </w:p>
-        </w:tc>
-        <w:tc>
-          <w:tcPr>
-            <w:tcW w:type="dxa" w:w="1234"/>
-          </w:tcPr>
-          <w:p>
-            <w:r>
-              <w:rPr>
-                <w:b/>
-                <w:sz w:val="16"/>
-              </w:rPr>
-              <w:t>C1 OOC</w:t>
-            </w:r>
-          </w:p>
-        </w:tc>
-        <w:tc>
-          <w:tcPr>
-            <w:tcW w:type="dxa" w:w="1234"/>
-          </w:tcPr>
-          <w:p>
-            <w:r>
-              <w:rPr>
-                <w:b/>
-                <w:sz w:val="16"/>
-              </w:rPr>
-              <w:t>C2 Manip</w:t>
-            </w:r>
-          </w:p>
-        </w:tc>
-        <w:tc>
-          <w:tcPr>
-            <w:tcW w:type="dxa" w:w="1234"/>
-          </w:tcPr>
-          <w:p>
-            <w:r>
-              <w:rPr>
-                <w:b/>
-                <w:sz w:val="16"/>
-              </w:rPr>
-              <w:t>C3 AI-Text</w:t>
-            </w:r>
-          </w:p>
-        </w:tc>
-        <w:tc>
-          <w:tcPr>
-            <w:tcW w:type="dxa" w:w="1234"/>
-          </w:tcPr>
-          <w:p>
-            <w:r>
-              <w:rPr>
-                <w:b/>
-                <w:sz w:val="16"/>
-              </w:rPr>
-              <w:t>C4 FullFab</w:t>
-            </w:r>
-          </w:p>
-        </w:tc>
-      </w:tr>
-      <w:tr>
-        <w:tc>
-          <w:tcPr>
-            <w:tcW w:type="dxa" w:w="1234"/>
-          </w:tcPr>
-          <w:p>
-            <w:r>
-              <w:rPr>
-                <w:sz w:val="16"/>
-              </w:rPr>
-              <w:t>fndclip (semantic only)</w:t>
-            </w:r>
-          </w:p>
-        </w:tc>
-        <w:tc>
-          <w:tcPr>
-            <w:tcW w:type="dxa" w:w="1234"/>
-          </w:tcPr>
-          <w:p>
-            <w:r>
-              <w:rPr>
-                <w:sz w:val="16"/>
-              </w:rPr>
-              <w:t>0.6681</w:t>
-            </w:r>
-          </w:p>
-        </w:tc>
-        <w:tc>
-          <w:tcPr>
-            <w:tcW w:type="dxa" w:w="1234"/>
-          </w:tcPr>
-          <w:p>
-            <w:r>
-              <w:rPr>
-                <w:sz w:val="16"/>
-              </w:rPr>
-              <w:t>0.451</w:t>
-            </w:r>
-          </w:p>
-        </w:tc>
-        <w:tc>
-          <w:tcPr>
-            <w:tcW w:type="dxa" w:w="1234"/>
-          </w:tcPr>
-          <w:p>
-            <w:r>
-              <w:rPr>
-                <w:sz w:val="16"/>
-              </w:rPr>
-              <w:t>0.306</w:t>
-            </w:r>
-          </w:p>
-        </w:tc>
-        <w:tc>
-          <w:tcPr>
-            <w:tcW w:type="dxa" w:w="1234"/>
-          </w:tcPr>
-          <w:p>
-            <w:r>
-              <w:rPr>
-                <w:sz w:val="16"/>
-              </w:rPr>
-              <w:t>0.738</w:t>
-            </w:r>
-          </w:p>
-        </w:tc>
-        <w:tc>
-          <w:tcPr>
-            <w:tcW w:type="dxa" w:w="1234"/>
-          </w:tcPr>
-          <w:p>
-            <w:r>
-              <w:rPr>
-                <w:sz w:val="16"/>
-              </w:rPr>
-              <w:t>0.886</w:t>
-            </w:r>
-          </w:p>
-        </w:tc>
-        <w:tc>
-          <w:tcPr>
-            <w:tcW w:type="dxa" w:w="1234"/>
-          </w:tcPr>
-          <w:p>
-            <w:r>
-              <w:rPr>
-                <w:sz w:val="16"/>
-              </w:rPr>
-              <w:t>0.960</w:t>
-            </w:r>
-          </w:p>
-        </w:tc>
-      </w:tr>
-      <w:tr>
-        <w:tc>
-          <w:tcPr>
-            <w:tcW w:type="dxa" w:w="1234"/>
-          </w:tcPr>
-          <w:p>
-            <w:r>
-              <w:rPr>
-                <w:sz w:val="16"/>
-              </w:rPr>
-              <w:t>fndclip + text</w:t>
-            </w:r>
-          </w:p>
-        </w:tc>
-        <w:tc>
-          <w:tcPr>
-            <w:tcW w:type="dxa" w:w="1234"/>
-          </w:tcPr>
-          <w:p>
-            <w:r>
-              <w:rPr>
-                <w:sz w:val="16"/>
-              </w:rPr>
-              <w:t>0.7103</w:t>
-            </w:r>
-          </w:p>
-        </w:tc>
-        <w:tc>
-          <w:tcPr>
-            <w:tcW w:type="dxa" w:w="1234"/>
-          </w:tcPr>
-          <w:p>
-            <w:r>
-              <w:rPr>
-                <w:sz w:val="16"/>
-              </w:rPr>
-              <w:t>0.411</w:t>
-            </w:r>
-          </w:p>
-        </w:tc>
-        <w:tc>
-          <w:tcPr>
-            <w:tcW w:type="dxa" w:w="1234"/>
-          </w:tcPr>
-          <w:p>
-            <w:r>
-              <w:rPr>
-                <w:sz w:val="16"/>
-              </w:rPr>
-              <w:t>0.448</w:t>
-            </w:r>
-          </w:p>
-        </w:tc>
-        <w:tc>
-          <w:tcPr>
-            <w:tcW w:type="dxa" w:w="1234"/>
-          </w:tcPr>
-          <w:p>
-            <w:r>
-              <w:rPr>
-                <w:sz w:val="16"/>
-              </w:rPr>
-              <w:t>0.731</w:t>
-            </w:r>
-          </w:p>
-        </w:tc>
-        <w:tc>
-          <w:tcPr>
-            <w:tcW w:type="dxa" w:w="1234"/>
-          </w:tcPr>
-          <w:p>
-            <w:r>
-              <w:rPr>
-                <w:sz w:val="16"/>
-              </w:rPr>
-              <w:t>0.981</w:t>
-            </w:r>
-          </w:p>
-        </w:tc>
-        <w:tc>
-          <w:tcPr>
-            <w:tcW w:type="dxa" w:w="1234"/>
-          </w:tcPr>
-          <w:p>
-            <w:r>
-              <w:rPr>
-                <w:sz w:val="16"/>
-              </w:rPr>
-              <w:t>0.982</w:t>
-            </w:r>
-          </w:p>
-        </w:tc>
-      </w:tr>
-      <w:tr>
-        <w:tc>
-          <w:tcPr>
-            <w:tcW w:type="dxa" w:w="1234"/>
-          </w:tcPr>
-          <w:p>
-            <w:r>
-              <w:rPr>
-                <w:sz w:val="16"/>
-              </w:rPr>
-              <w:t>fndclip + image</w:t>
-            </w:r>
-          </w:p>
-        </w:tc>
-        <w:tc>
-          <w:tcPr>
-            <w:tcW w:type="dxa" w:w="1234"/>
-          </w:tcPr>
-          <w:p>
-            <w:r>
-              <w:rPr>
-                <w:sz w:val="16"/>
-              </w:rPr>
-              <w:t>0.6975</w:t>
-            </w:r>
-          </w:p>
-        </w:tc>
-        <w:tc>
-          <w:tcPr>
-            <w:tcW w:type="dxa" w:w="1234"/>
-          </w:tcPr>
-          <w:p>
-            <w:r>
-              <w:rPr>
-                <w:sz w:val="16"/>
-              </w:rPr>
-              <w:t>0.391</w:t>
-            </w:r>
-          </w:p>
-        </w:tc>
-        <w:tc>
-          <w:tcPr>
-            <w:tcW w:type="dxa" w:w="1234"/>
-          </w:tcPr>
-          <w:p>
-            <w:r>
-              <w:rPr>
-                <w:sz w:val="16"/>
-              </w:rPr>
-              <w:t>0.464</w:t>
-            </w:r>
-          </w:p>
-        </w:tc>
-        <w:tc>
-          <w:tcPr>
-            <w:tcW w:type="dxa" w:w="1234"/>
-          </w:tcPr>
-          <w:p>
-            <w:r>
-              <w:rPr>
-                <w:sz w:val="16"/>
-              </w:rPr>
-              <w:t>0.751</w:t>
-            </w:r>
-          </w:p>
-        </w:tc>
-        <w:tc>
-          <w:tcPr>
-            <w:tcW w:type="dxa" w:w="1234"/>
-          </w:tcPr>
-          <w:p>
-            <w:r>
-              <w:rPr>
-                <w:sz w:val="16"/>
-              </w:rPr>
-              <w:t>0.911</w:t>
-            </w:r>
-          </w:p>
-        </w:tc>
-        <w:tc>
-          <w:tcPr>
-            <w:tcW w:type="dxa" w:w="1234"/>
-          </w:tcPr>
-          <w:p>
-            <w:r>
-              <w:rPr>
-                <w:sz w:val="16"/>
-              </w:rPr>
-              <w:t>0.970</w:t>
-            </w:r>
-          </w:p>
-        </w:tc>
-      </w:tr>
-      <w:tr>
-        <w:tc>
-          <w:tcPr>
-            <w:tcW w:type="dxa" w:w="1234"/>
-          </w:tcPr>
-          <w:p>
-            <w:r>
-              <w:rPr>
-                <w:sz w:val="16"/>
-              </w:rPr>
-              <w:t>all three (full)</w:t>
-            </w:r>
-          </w:p>
-        </w:tc>
-        <w:tc>
-          <w:tcPr>
-            <w:tcW w:type="dxa" w:w="1234"/>
-          </w:tcPr>
-          <w:p>
-            <w:r>
-              <w:rPr>
-                <w:sz w:val="16"/>
-              </w:rPr>
-              <w:t>0.7157</w:t>
-            </w:r>
-          </w:p>
-        </w:tc>
-        <w:tc>
-          <w:tcPr>
-            <w:tcW w:type="dxa" w:w="1234"/>
-          </w:tcPr>
-          <w:p>
-            <w:r>
-              <w:rPr>
-                <w:sz w:val="16"/>
-              </w:rPr>
-              <w:t>0.430</w:t>
-            </w:r>
-          </w:p>
-        </w:tc>
-        <w:tc>
-          <w:tcPr>
-            <w:tcW w:type="dxa" w:w="1234"/>
-          </w:tcPr>
-          <w:p>
-            <w:r>
-              <w:rPr>
-                <w:sz w:val="16"/>
-              </w:rPr>
-              <w:t>0.426</w:t>
-            </w:r>
-          </w:p>
-        </w:tc>
-        <w:tc>
-          <w:tcPr>
-            <w:tcW w:type="dxa" w:w="1234"/>
-          </w:tcPr>
-          <w:p>
-            <w:r>
-              <w:rPr>
-                <w:sz w:val="16"/>
-              </w:rPr>
-              <w:t>0.752</w:t>
-            </w:r>
-          </w:p>
-        </w:tc>
-        <w:tc>
-          <w:tcPr>
-            <w:tcW w:type="dxa" w:w="1234"/>
-          </w:tcPr>
-          <w:p>
-            <w:r>
-              <w:rPr>
-                <w:sz w:val="16"/>
-              </w:rPr>
-              <w:t>0.985</w:t>
-            </w:r>
-          </w:p>
-        </w:tc>
-        <w:tc>
-          <w:tcPr>
-            <w:tcW w:type="dxa" w:w="1234"/>
-          </w:tcPr>
-          <w:p>
-            <w:r>
-              <w:rPr>
-                <w:sz w:val="16"/>
-              </w:rPr>
-              <w:t>0.985</w:t>
-            </w:r>
-          </w:p>
-        </w:tc>
-      </w:tr>
-    </w:tbl>
-    <w:p/>
-    <w:p>
-      <w:pPr>
-        <w:pStyle w:val="Heading2"/>
-      </w:pPr>
-      <w:r>
-        <w:t>Result R4 — Ablation B: Inference-time Leave-One-Out</w:t>
-      </w:r>
-    </w:p>
-    <w:p>
-      <w:r>
-        <w:t>One branch zeroed at inference on the shipped ensemble. Source: docs/IMAGE_BRANCH_ABLATION.md.</w:t>
-      </w:r>
-    </w:p>
-    <w:tbl>
-      <w:tblPr>
-        <w:tblStyle w:val="LightGrid-Accent1"/>
-        <w:tblW w:type="auto" w:w="0"/>
-        <w:tblLook w:firstColumn="1" w:firstRow="1" w:lastColumn="0" w:lastRow="0" w:noHBand="0" w:noVBand="1" w:val="04A0"/>
-      </w:tblPr>
-      <w:tblGrid>
-        <w:gridCol w:w="1728"/>
-        <w:gridCol w:w="1728"/>
-        <w:gridCol w:w="1728"/>
-        <w:gridCol w:w="1728"/>
-        <w:gridCol w:w="1728"/>
-      </w:tblGrid>
-      <w:tr>
-        <w:tc>
-          <w:tcPr>
-            <w:tcW w:type="dxa" w:w="1728"/>
-          </w:tcPr>
-          <w:p>
-            <w:r>
-              <w:rPr>
-                <w:b/>
-                <w:sz w:val="18"/>
-              </w:rPr>
-              <w:t>Variant</w:t>
-            </w:r>
-          </w:p>
-        </w:tc>
-        <w:tc>
-          <w:tcPr>
-            <w:tcW w:type="dxa" w:w="1728"/>
-          </w:tcPr>
-          <w:p>
-            <w:r>
-              <w:rPr>
-                <w:b/>
-                <w:sz w:val="18"/>
-              </w:rPr>
-              <w:t>Test F1</w:t>
-            </w:r>
-          </w:p>
-        </w:tc>
-        <w:tc>
-          <w:tcPr>
-            <w:tcW w:type="dxa" w:w="1728"/>
-          </w:tcPr>
-          <w:p>
-            <w:r>
-              <w:rPr>
-                <w:b/>
-                <w:sz w:val="18"/>
-              </w:rPr>
-              <w:t>ΔF1</w:t>
-            </w:r>
-          </w:p>
-        </w:tc>
-        <w:tc>
-          <w:tcPr>
-            <w:tcW w:type="dxa" w:w="1728"/>
-          </w:tcPr>
-          <w:p>
-            <w:r>
-              <w:rPr>
-                <w:b/>
-                <w:sz w:val="18"/>
-              </w:rPr>
-              <w:t>C2 Manip</w:t>
-            </w:r>
-          </w:p>
-        </w:tc>
-        <w:tc>
-          <w:tcPr>
-            <w:tcW w:type="dxa" w:w="1728"/>
-          </w:tcPr>
-          <w:p>
-            <w:r>
-              <w:rPr>
-                <w:b/>
-                <w:sz w:val="18"/>
-              </w:rPr>
-              <w:t>Note</w:t>
-            </w:r>
-          </w:p>
-        </w:tc>
-      </w:tr>
-      <w:tr>
-        <w:tc>
-          <w:tcPr>
-            <w:tcW w:type="dxa" w:w="1728"/>
-          </w:tcPr>
-          <w:p>
-            <w:r>
-              <w:rPr>
-                <w:sz w:val="18"/>
-              </w:rPr>
-              <w:t>full pipeline</w:t>
-            </w:r>
-          </w:p>
-        </w:tc>
-        <w:tc>
-          <w:tcPr>
-            <w:tcW w:type="dxa" w:w="1728"/>
-          </w:tcPr>
-          <w:p>
-            <w:r>
-              <w:rPr>
-                <w:sz w:val="18"/>
-              </w:rPr>
-              <w:t>0.7149</w:t>
-            </w:r>
-          </w:p>
-        </w:tc>
-        <w:tc>
-          <w:tcPr>
-            <w:tcW w:type="dxa" w:w="1728"/>
-          </w:tcPr>
-          <w:p>
-            <w:r>
-              <w:rPr>
-                <w:sz w:val="18"/>
-              </w:rPr>
-              <w:t>—</w:t>
-            </w:r>
-          </w:p>
-        </w:tc>
-        <w:tc>
-          <w:tcPr>
-            <w:tcW w:type="dxa" w:w="1728"/>
-          </w:tcPr>
-          <w:p>
-            <w:r>
-              <w:rPr>
-                <w:sz w:val="18"/>
-              </w:rPr>
-              <w:t>0.757</w:t>
-            </w:r>
-          </w:p>
-        </w:tc>
-        <w:tc>
-          <w:tcPr>
-            <w:tcW w:type="dxa" w:w="1728"/>
-          </w:tcPr>
-          <w:p>
-            <w:r>
-              <w:rPr>
-                <w:sz w:val="18"/>
-              </w:rPr>
-              <w:t>baseline</w:t>
-            </w:r>
-          </w:p>
-        </w:tc>
-      </w:tr>
-      <w:tr>
-        <w:tc>
-          <w:tcPr>
-            <w:tcW w:type="dxa" w:w="1728"/>
-          </w:tcPr>
-          <w:p>
-            <w:r>
-              <w:rPr>
-                <w:sz w:val="18"/>
-              </w:rPr>
-              <w:t>disable image (v_imgfor)</w:t>
-            </w:r>
-          </w:p>
-        </w:tc>
-        <w:tc>
-          <w:tcPr>
-            <w:tcW w:type="dxa" w:w="1728"/>
-          </w:tcPr>
-          <w:p>
-            <w:r>
-              <w:rPr>
-                <w:sz w:val="18"/>
-              </w:rPr>
-              <w:t>0.6954</w:t>
-            </w:r>
-          </w:p>
-        </w:tc>
-        <w:tc>
-          <w:tcPr>
-            <w:tcW w:type="dxa" w:w="1728"/>
-          </w:tcPr>
-          <w:p>
-            <w:r>
-              <w:rPr>
-                <w:sz w:val="18"/>
-              </w:rPr>
-              <w:t>-2.0 pp</w:t>
-            </w:r>
-          </w:p>
-        </w:tc>
-        <w:tc>
-          <w:tcPr>
-            <w:tcW w:type="dxa" w:w="1728"/>
-          </w:tcPr>
-          <w:p>
-            <w:r>
-              <w:rPr>
-                <w:sz w:val="18"/>
-              </w:rPr>
-              <w:t>0.733</w:t>
-            </w:r>
-          </w:p>
-        </w:tc>
-        <w:tc>
-          <w:tcPr>
-            <w:tcW w:type="dxa" w:w="1728"/>
-          </w:tcPr>
-          <w:p>
-            <w:r>
-              <w:rPr>
-                <w:sz w:val="18"/>
-              </w:rPr>
-              <w:t>image removal hits C2 most</w:t>
-            </w:r>
-          </w:p>
-        </w:tc>
-      </w:tr>
-      <w:tr>
-        <w:tc>
-          <w:tcPr>
-            <w:tcW w:type="dxa" w:w="1728"/>
-          </w:tcPr>
-          <w:p>
-            <w:r>
-              <w:rPr>
-                <w:sz w:val="18"/>
-              </w:rPr>
-              <w:t>disable text (v_textfor)</w:t>
-            </w:r>
-          </w:p>
-        </w:tc>
-        <w:tc>
-          <w:tcPr>
-            <w:tcW w:type="dxa" w:w="1728"/>
-          </w:tcPr>
-          <w:p>
-            <w:r>
-              <w:rPr>
-                <w:sz w:val="18"/>
-              </w:rPr>
-              <w:t>0.4494</w:t>
-            </w:r>
-          </w:p>
-        </w:tc>
-        <w:tc>
-          <w:tcPr>
-            <w:tcW w:type="dxa" w:w="1728"/>
-          </w:tcPr>
-          <w:p>
-            <w:r>
-              <w:rPr>
-                <w:sz w:val="18"/>
-              </w:rPr>
-              <w:t>-26.6 pp</w:t>
-            </w:r>
-          </w:p>
-        </w:tc>
-        <w:tc>
-          <w:tcPr>
-            <w:tcW w:type="dxa" w:w="1728"/>
-          </w:tcPr>
-          <w:p>
-            <w:r>
-              <w:rPr>
-                <w:sz w:val="18"/>
-              </w:rPr>
-              <w:t>0.710</w:t>
-            </w:r>
-          </w:p>
-        </w:tc>
-        <w:tc>
-          <w:tcPr>
-            <w:tcW w:type="dxa" w:w="1728"/>
-          </w:tcPr>
-          <w:p>
-            <w:r>
-              <w:rPr>
-                <w:sz w:val="18"/>
-              </w:rPr>
-              <w:t>text dominates C3/C4</w:t>
-            </w:r>
-          </w:p>
-        </w:tc>
-      </w:tr>
-      <w:tr>
-        <w:tc>
-          <w:tcPr>
-            <w:tcW w:type="dxa" w:w="1728"/>
-          </w:tcPr>
-          <w:p>
-            <w:r>
-              <w:rPr>
-                <w:sz w:val="18"/>
-              </w:rPr>
-              <w:t>semantic only</w:t>
-            </w:r>
-          </w:p>
-        </w:tc>
-        <w:tc>
-          <w:tcPr>
-            <w:tcW w:type="dxa" w:w="1728"/>
-          </w:tcPr>
-          <w:p>
-            <w:r>
-              <w:rPr>
-                <w:sz w:val="18"/>
-              </w:rPr>
-              <w:t>0.3146</w:t>
-            </w:r>
-          </w:p>
-        </w:tc>
-        <w:tc>
-          <w:tcPr>
-            <w:tcW w:type="dxa" w:w="1728"/>
-          </w:tcPr>
-          <w:p>
-            <w:r>
-              <w:rPr>
-                <w:sz w:val="18"/>
-              </w:rPr>
-              <w:t>-40.0 pp</w:t>
-            </w:r>
-          </w:p>
-        </w:tc>
-        <w:tc>
-          <w:tcPr>
-            <w:tcW w:type="dxa" w:w="1728"/>
-          </w:tcPr>
-          <w:p>
-            <w:r>
-              <w:rPr>
-                <w:sz w:val="18"/>
-              </w:rPr>
-              <w:t>0.655</w:t>
-            </w:r>
-          </w:p>
-        </w:tc>
-        <w:tc>
-          <w:tcPr>
-            <w:tcW w:type="dxa" w:w="1728"/>
-          </w:tcPr>
-          <w:p>
-            <w:r>
-              <w:rPr>
-                <w:sz w:val="18"/>
-              </w:rPr>
-              <w:t>—</w:t>
-            </w:r>
-          </w:p>
-        </w:tc>
-      </w:tr>
-    </w:tbl>
-    <w:p/>
-    <w:p>
-      <w:pPr>
-        <w:pStyle w:val="Heading2"/>
-      </w:pPr>
-      <w:r>
-        <w:t>Result R5 — Per-Seed Results &amp; External Transfer</w:t>
-      </w:r>
-    </w:p>
-    <w:p>
-      <w:r>
-        <w:t>Source: phases/v4/docs/eval/honest_run_summary.json.</w:t>
-      </w:r>
-    </w:p>
-    <w:tbl>
-      <w:tblPr>
-        <w:tblStyle w:val="LightGrid-Accent1"/>
-        <w:tblW w:type="auto" w:w="0"/>
-        <w:tblLook w:firstColumn="1" w:firstRow="1" w:lastColumn="0" w:lastRow="0" w:noHBand="0" w:noVBand="1" w:val="04A0"/>
-      </w:tblPr>
-      <w:tblGrid>
-        <w:gridCol w:w="2880"/>
-        <w:gridCol w:w="2880"/>
-        <w:gridCol w:w="2880"/>
-      </w:tblGrid>
-      <w:tr>
-        <w:tc>
-          <w:tcPr>
-            <w:tcW w:type="dxa" w:w="2880"/>
-          </w:tcPr>
-          <w:p>
-            <w:r>
-              <w:rPr>
-                <w:b/>
-                <w:sz w:val="18"/>
-              </w:rPr>
-              <w:t>Seed</w:t>
-            </w:r>
-          </w:p>
-        </w:tc>
-        <w:tc>
-          <w:tcPr>
-            <w:tcW w:type="dxa" w:w="2880"/>
-          </w:tcPr>
-          <w:p>
-            <w:r>
-              <w:rPr>
-                <w:b/>
-                <w:sz w:val="18"/>
-              </w:rPr>
-              <w:t>Test F1-macro</w:t>
-            </w:r>
-          </w:p>
-        </w:tc>
-        <w:tc>
-          <w:tcPr>
-            <w:tcW w:type="dxa" w:w="2880"/>
-          </w:tcPr>
-          <w:p>
-            <w:r>
-              <w:rPr>
-                <w:b/>
-                <w:sz w:val="18"/>
-              </w:rPr>
-              <w:t>MMFakeBench transfer F1 (raw)</w:t>
-            </w:r>
-          </w:p>
-        </w:tc>
-      </w:tr>
-      <w:tr>
-        <w:tc>
-          <w:tcPr>
-            <w:tcW w:type="dxa" w:w="2880"/>
-          </w:tcPr>
-          <w:p>
-            <w:r>
-              <w:rPr>
-                <w:sz w:val="18"/>
-              </w:rPr>
-              <w:t>42</w:t>
-            </w:r>
-          </w:p>
-        </w:tc>
-        <w:tc>
-          <w:tcPr>
-            <w:tcW w:type="dxa" w:w="2880"/>
-          </w:tcPr>
-          <w:p>
-            <w:r>
-              <w:rPr>
-                <w:sz w:val="18"/>
-              </w:rPr>
-              <w:t>0.7152</w:t>
-            </w:r>
-          </w:p>
-        </w:tc>
-        <w:tc>
-          <w:tcPr>
-            <w:tcW w:type="dxa" w:w="2880"/>
-          </w:tcPr>
-          <w:p>
-            <w:r>
-              <w:rPr>
-                <w:sz w:val="18"/>
-              </w:rPr>
-              <w:t>0.3516</w:t>
-            </w:r>
-          </w:p>
-        </w:tc>
-      </w:tr>
-      <w:tr>
-        <w:tc>
-          <w:tcPr>
-            <w:tcW w:type="dxa" w:w="2880"/>
-          </w:tcPr>
-          <w:p>
-            <w:r>
-              <w:rPr>
-                <w:sz w:val="18"/>
-              </w:rPr>
-              <w:t>1337</w:t>
-            </w:r>
-          </w:p>
-        </w:tc>
-        <w:tc>
-          <w:tcPr>
-            <w:tcW w:type="dxa" w:w="2880"/>
-          </w:tcPr>
-          <w:p>
-            <w:r>
-              <w:rPr>
-                <w:sz w:val="18"/>
-              </w:rPr>
-              <w:t>0.7189</w:t>
-            </w:r>
-          </w:p>
-        </w:tc>
-        <w:tc>
-          <w:tcPr>
-            <w:tcW w:type="dxa" w:w="2880"/>
-          </w:tcPr>
-          <w:p>
-            <w:r>
-              <w:rPr>
-                <w:sz w:val="18"/>
-              </w:rPr>
-              <w:t>0.3446</w:t>
-            </w:r>
-          </w:p>
-        </w:tc>
-      </w:tr>
-      <w:tr>
-        <w:tc>
-          <w:tcPr>
-            <w:tcW w:type="dxa" w:w="2880"/>
-          </w:tcPr>
-          <w:p>
-            <w:r>
-              <w:rPr>
-                <w:sz w:val="18"/>
-              </w:rPr>
-              <w:t>2024</w:t>
-            </w:r>
-          </w:p>
-        </w:tc>
-        <w:tc>
-          <w:tcPr>
-            <w:tcW w:type="dxa" w:w="2880"/>
-          </w:tcPr>
-          <w:p>
-            <w:r>
-              <w:rPr>
-                <w:sz w:val="18"/>
-              </w:rPr>
-              <w:t>0.7009</w:t>
-            </w:r>
-          </w:p>
-        </w:tc>
-        <w:tc>
-          <w:tcPr>
-            <w:tcW w:type="dxa" w:w="2880"/>
-          </w:tcPr>
-          <w:p>
-            <w:r>
-              <w:rPr>
-                <w:sz w:val="18"/>
-              </w:rPr>
-              <w:t>0.4308</w:t>
-            </w:r>
-          </w:p>
-        </w:tc>
-      </w:tr>
-      <w:tr>
-        <w:tc>
-          <w:tcPr>
-            <w:tcW w:type="dxa" w:w="2880"/>
-          </w:tcPr>
-          <w:p>
-            <w:r>
-              <w:rPr>
-                <w:sz w:val="18"/>
-              </w:rPr>
-              <w:t>mean ± std</w:t>
-            </w:r>
-          </w:p>
-        </w:tc>
-        <w:tc>
-          <w:tcPr>
-            <w:tcW w:type="dxa" w:w="2880"/>
-          </w:tcPr>
-          <w:p>
-            <w:r>
-              <w:rPr>
-                <w:sz w:val="18"/>
-              </w:rPr>
-              <w:t>0.7117 ± 0.0095</w:t>
-            </w:r>
-          </w:p>
-        </w:tc>
-        <w:tc>
-          <w:tcPr>
-            <w:tcW w:type="dxa" w:w="2880"/>
-          </w:tcPr>
-          <w:p>
-            <w:r>
-              <w:rPr>
-                <w:sz w:val="18"/>
-              </w:rPr>
-              <w:t>0.3757 ± 0.0479</w:t>
-            </w:r>
-          </w:p>
-        </w:tc>
-      </w:tr>
-      <w:tr>
-        <w:tc>
-          <w:tcPr>
-            <w:tcW w:type="dxa" w:w="2880"/>
-          </w:tcPr>
-          <w:p>
-            <w:r>
-              <w:rPr>
-                <w:sz w:val="18"/>
-              </w:rPr>
-              <w:t>3-seed ensemble</w:t>
-            </w:r>
-          </w:p>
-        </w:tc>
-        <w:tc>
-          <w:tcPr>
-            <w:tcW w:type="dxa" w:w="2880"/>
-          </w:tcPr>
-          <w:p>
-            <w:r>
-              <w:rPr>
-                <w:sz w:val="18"/>
-              </w:rPr>
-              <w:t>0.7149</w:t>
-            </w:r>
-          </w:p>
-        </w:tc>
-        <w:tc>
-          <w:tcPr>
-            <w:tcW w:type="dxa" w:w="2880"/>
-          </w:tcPr>
-          <w:p>
-            <w:r>
-              <w:rPr>
-                <w:sz w:val="18"/>
-              </w:rPr>
-              <w:t>0.4308 (raw) / 0.7197 (bias-corrected)</w:t>
-            </w:r>
-          </w:p>
-        </w:tc>
-      </w:tr>
-    </w:tbl>
-    <w:p/>
-    <w:p>
-      <w:pPr>
-        <w:pStyle w:val="Heading2"/>
-      </w:pPr>
-      <w:r>
-        <w:t>Result R6 — Forensic Image Detectors (8/8 generators)</w:t>
-      </w:r>
-    </w:p>
-    <w:p>
-      <w:r>
-        <w:t>Two standalone binary real-vs-AI detectors. Metric = Average Precision (AP). Source: docs/MODEL_REPORT.md §4, outputs/eval_table_combined.md.</w:t>
-      </w:r>
-    </w:p>
-    <w:tbl>
-      <w:tblPr>
-        <w:tblStyle w:val="LightGrid-Accent1"/>
-        <w:tblW w:type="auto" w:w="0"/>
-        <w:tblLook w:firstColumn="1" w:firstRow="1" w:lastColumn="0" w:lastRow="0" w:noHBand="0" w:noVBand="1" w:val="04A0"/>
-      </w:tblPr>
-      <w:tblGrid>
-        <w:gridCol w:w="2160"/>
-        <w:gridCol w:w="2160"/>
-        <w:gridCol w:w="2160"/>
-        <w:gridCol w:w="2160"/>
-      </w:tblGrid>
-      <w:tr>
-        <w:tc>
-          <w:tcPr>
-            <w:tcW w:type="dxa" w:w="2160"/>
-          </w:tcPr>
-          <w:p>
-            <w:r>
-              <w:rPr>
-                <w:b/>
-                <w:sz w:val="18"/>
-              </w:rPr>
-              <w:t>Generator</w:t>
-            </w:r>
-          </w:p>
-        </w:tc>
-        <w:tc>
-          <w:tcPr>
-            <w:tcW w:type="dxa" w:w="2160"/>
-          </w:tcPr>
-          <w:p>
-            <w:r>
-              <w:rPr>
-                <w:b/>
-                <w:sz w:val="18"/>
-              </w:rPr>
-              <w:t>Type</w:t>
-            </w:r>
-          </w:p>
-        </w:tc>
-        <w:tc>
-          <w:tcPr>
-            <w:tcW w:type="dxa" w:w="2160"/>
-          </w:tcPr>
-          <w:p>
-            <w:r>
-              <w:rPr>
-                <w:b/>
-                <w:sz w:val="18"/>
-              </w:rPr>
-              <w:t>A1 RGB+Fourier AP</w:t>
-            </w:r>
-          </w:p>
-        </w:tc>
-        <w:tc>
-          <w:tcPr>
-            <w:tcW w:type="dxa" w:w="2160"/>
-          </w:tcPr>
-          <w:p>
-            <w:r>
-              <w:rPr>
-                <w:b/>
-                <w:sz w:val="18"/>
-              </w:rPr>
-              <w:t>A2 DCT AP</w:t>
-            </w:r>
-          </w:p>
-        </w:tc>
-      </w:tr>
-      <w:tr>
-        <w:tc>
-          <w:tcPr>
-            <w:tcW w:type="dxa" w:w="2160"/>
-          </w:tcPr>
-          <w:p>
-            <w:r>
-              <w:rPr>
-                <w:sz w:val="18"/>
-              </w:rPr>
-              <w:t>midjourney</w:t>
-            </w:r>
-          </w:p>
-        </w:tc>
-        <w:tc>
-          <w:tcPr>
-            <w:tcW w:type="dxa" w:w="2160"/>
-          </w:tcPr>
-          <w:p>
-            <w:r>
-              <w:rPr>
-                <w:sz w:val="18"/>
-              </w:rPr>
-              <w:t>Diffusion</w:t>
-            </w:r>
-          </w:p>
-        </w:tc>
-        <w:tc>
-          <w:tcPr>
-            <w:tcW w:type="dxa" w:w="2160"/>
-          </w:tcPr>
-          <w:p>
-            <w:r>
-              <w:rPr>
-                <w:sz w:val="18"/>
-              </w:rPr>
-              <w:t>0.965</w:t>
-            </w:r>
-          </w:p>
-        </w:tc>
-        <w:tc>
-          <w:tcPr>
-            <w:tcW w:type="dxa" w:w="2160"/>
-          </w:tcPr>
-          <w:p>
-            <w:r>
-              <w:rPr>
-                <w:sz w:val="18"/>
-              </w:rPr>
-              <w:t>0.828</w:t>
-            </w:r>
-          </w:p>
-        </w:tc>
-      </w:tr>
-      <w:tr>
-        <w:tc>
-          <w:tcPr>
-            <w:tcW w:type="dxa" w:w="2160"/>
-          </w:tcPr>
-          <w:p>
-            <w:r>
-              <w:rPr>
-                <w:sz w:val="18"/>
-              </w:rPr>
-              <w:t>sdv1_4</w:t>
-            </w:r>
-          </w:p>
-        </w:tc>
-        <w:tc>
-          <w:tcPr>
-            <w:tcW w:type="dxa" w:w="2160"/>
-          </w:tcPr>
-          <w:p>
-            <w:r>
-              <w:rPr>
-                <w:sz w:val="18"/>
-              </w:rPr>
-              <w:t>Diffusion</w:t>
-            </w:r>
-          </w:p>
-        </w:tc>
-        <w:tc>
-          <w:tcPr>
-            <w:tcW w:type="dxa" w:w="2160"/>
-          </w:tcPr>
-          <w:p>
-            <w:r>
-              <w:rPr>
-                <w:sz w:val="18"/>
-              </w:rPr>
-              <w:t>0.988</w:t>
-            </w:r>
-          </w:p>
-        </w:tc>
-        <w:tc>
-          <w:tcPr>
-            <w:tcW w:type="dxa" w:w="2160"/>
-          </w:tcPr>
-          <w:p>
-            <w:r>
-              <w:rPr>
-                <w:sz w:val="18"/>
-              </w:rPr>
-              <w:t>0.890</w:t>
-            </w:r>
-          </w:p>
-        </w:tc>
-      </w:tr>
-      <w:tr>
-        <w:tc>
-          <w:tcPr>
-            <w:tcW w:type="dxa" w:w="2160"/>
-          </w:tcPr>
-          <w:p>
-            <w:r>
-              <w:rPr>
-                <w:sz w:val="18"/>
-              </w:rPr>
-              <w:t>sdv1_5</w:t>
-            </w:r>
-          </w:p>
-        </w:tc>
-        <w:tc>
-          <w:tcPr>
-            <w:tcW w:type="dxa" w:w="2160"/>
-          </w:tcPr>
-          <w:p>
-            <w:r>
-              <w:rPr>
-                <w:sz w:val="18"/>
-              </w:rPr>
-              <w:t>Diffusion</w:t>
-            </w:r>
-          </w:p>
-        </w:tc>
-        <w:tc>
-          <w:tcPr>
-            <w:tcW w:type="dxa" w:w="2160"/>
-          </w:tcPr>
-          <w:p>
-            <w:r>
-              <w:rPr>
-                <w:sz w:val="18"/>
-              </w:rPr>
-              <w:t>0.985</w:t>
-            </w:r>
-          </w:p>
-        </w:tc>
-        <w:tc>
-          <w:tcPr>
-            <w:tcW w:type="dxa" w:w="2160"/>
-          </w:tcPr>
-          <w:p>
-            <w:r>
-              <w:rPr>
-                <w:sz w:val="18"/>
-              </w:rPr>
-              <w:t>0.896</w:t>
-            </w:r>
-          </w:p>
-        </w:tc>
-      </w:tr>
-      <w:tr>
-        <w:tc>
-          <w:tcPr>
-            <w:tcW w:type="dxa" w:w="2160"/>
-          </w:tcPr>
-          <w:p>
-            <w:r>
-              <w:rPr>
-                <w:sz w:val="18"/>
-              </w:rPr>
-              <w:t>wukong</w:t>
-            </w:r>
-          </w:p>
-        </w:tc>
-        <w:tc>
-          <w:tcPr>
-            <w:tcW w:type="dxa" w:w="2160"/>
-          </w:tcPr>
-          <w:p>
-            <w:r>
-              <w:rPr>
-                <w:sz w:val="18"/>
-              </w:rPr>
-              <w:t>Diffusion</w:t>
-            </w:r>
-          </w:p>
-        </w:tc>
-        <w:tc>
-          <w:tcPr>
-            <w:tcW w:type="dxa" w:w="2160"/>
-          </w:tcPr>
-          <w:p>
-            <w:r>
-              <w:rPr>
-                <w:sz w:val="18"/>
-              </w:rPr>
-              <w:t>0.980</w:t>
-            </w:r>
-          </w:p>
-        </w:tc>
-        <w:tc>
-          <w:tcPr>
-            <w:tcW w:type="dxa" w:w="2160"/>
-          </w:tcPr>
-          <w:p>
-            <w:r>
-              <w:rPr>
-                <w:sz w:val="18"/>
-              </w:rPr>
-              <w:t>0.902</w:t>
-            </w:r>
-          </w:p>
-        </w:tc>
-      </w:tr>
-      <w:tr>
-        <w:tc>
-          <w:tcPr>
-            <w:tcW w:type="dxa" w:w="2160"/>
-          </w:tcPr>
-          <w:p>
-            <w:r>
-              <w:rPr>
-                <w:sz w:val="18"/>
-              </w:rPr>
-              <w:t>vqdm</w:t>
-            </w:r>
-          </w:p>
-        </w:tc>
-        <w:tc>
-          <w:tcPr>
-            <w:tcW w:type="dxa" w:w="2160"/>
-          </w:tcPr>
-          <w:p>
-            <w:r>
-              <w:rPr>
-                <w:sz w:val="18"/>
-              </w:rPr>
-              <w:t>Diffusion</w:t>
-            </w:r>
-          </w:p>
-        </w:tc>
-        <w:tc>
-          <w:tcPr>
-            <w:tcW w:type="dxa" w:w="2160"/>
-          </w:tcPr>
-          <w:p>
-            <w:r>
-              <w:rPr>
-                <w:sz w:val="18"/>
-              </w:rPr>
-              <w:t>0.976</w:t>
-            </w:r>
-          </w:p>
-        </w:tc>
-        <w:tc>
-          <w:tcPr>
-            <w:tcW w:type="dxa" w:w="2160"/>
-          </w:tcPr>
-          <w:p>
-            <w:r>
-              <w:rPr>
-                <w:sz w:val="18"/>
-              </w:rPr>
-              <w:t>0.830</w:t>
-            </w:r>
-          </w:p>
-        </w:tc>
-      </w:tr>
-      <w:tr>
-        <w:tc>
-          <w:tcPr>
-            <w:tcW w:type="dxa" w:w="2160"/>
-          </w:tcPr>
-          <w:p>
-            <w:r>
-              <w:rPr>
-                <w:sz w:val="18"/>
-              </w:rPr>
-              <w:t>adm</w:t>
-            </w:r>
-          </w:p>
-        </w:tc>
-        <w:tc>
-          <w:tcPr>
-            <w:tcW w:type="dxa" w:w="2160"/>
-          </w:tcPr>
-          <w:p>
-            <w:r>
-              <w:rPr>
-                <w:sz w:val="18"/>
-              </w:rPr>
-              <w:t>Diffusion</w:t>
-            </w:r>
-          </w:p>
-        </w:tc>
-        <w:tc>
-          <w:tcPr>
-            <w:tcW w:type="dxa" w:w="2160"/>
-          </w:tcPr>
-          <w:p>
-            <w:r>
-              <w:rPr>
-                <w:sz w:val="18"/>
-              </w:rPr>
-              <w:t>0.997</w:t>
-            </w:r>
-          </w:p>
-        </w:tc>
-        <w:tc>
-          <w:tcPr>
-            <w:tcW w:type="dxa" w:w="2160"/>
-          </w:tcPr>
-          <w:p>
-            <w:r>
-              <w:rPr>
-                <w:sz w:val="18"/>
-              </w:rPr>
-              <w:t>0.971</w:t>
-            </w:r>
-          </w:p>
-        </w:tc>
-      </w:tr>
-      <w:tr>
-        <w:tc>
-          <w:tcPr>
-            <w:tcW w:type="dxa" w:w="2160"/>
-          </w:tcPr>
-          <w:p>
-            <w:r>
-              <w:rPr>
-                <w:sz w:val="18"/>
-              </w:rPr>
-              <w:t>glide</w:t>
-            </w:r>
-          </w:p>
-        </w:tc>
-        <w:tc>
-          <w:tcPr>
-            <w:tcW w:type="dxa" w:w="2160"/>
-          </w:tcPr>
-          <w:p>
-            <w:r>
-              <w:rPr>
-                <w:sz w:val="18"/>
-              </w:rPr>
-              <w:t>Diffusion</w:t>
-            </w:r>
-          </w:p>
-        </w:tc>
-        <w:tc>
-          <w:tcPr>
-            <w:tcW w:type="dxa" w:w="2160"/>
-          </w:tcPr>
-          <w:p>
-            <w:r>
-              <w:rPr>
-                <w:sz w:val="18"/>
-              </w:rPr>
-              <w:t>0.987</w:t>
-            </w:r>
-          </w:p>
-        </w:tc>
-        <w:tc>
-          <w:tcPr>
-            <w:tcW w:type="dxa" w:w="2160"/>
-          </w:tcPr>
-          <w:p>
-            <w:r>
-              <w:rPr>
-                <w:sz w:val="18"/>
-              </w:rPr>
-              <w:t>0.975</w:t>
-            </w:r>
-          </w:p>
-        </w:tc>
-      </w:tr>
-      <w:tr>
-        <w:tc>
-          <w:tcPr>
-            <w:tcW w:type="dxa" w:w="2160"/>
-          </w:tcPr>
-          <w:p>
-            <w:r>
-              <w:rPr>
-                <w:sz w:val="18"/>
-              </w:rPr>
-              <w:t>biggan</w:t>
-            </w:r>
-          </w:p>
-        </w:tc>
-        <w:tc>
-          <w:tcPr>
-            <w:tcW w:type="dxa" w:w="2160"/>
-          </w:tcPr>
-          <w:p>
-            <w:r>
-              <w:rPr>
-                <w:sz w:val="18"/>
-              </w:rPr>
-              <w:t>GAN</w:t>
-            </w:r>
-          </w:p>
-        </w:tc>
-        <w:tc>
-          <w:tcPr>
-            <w:tcW w:type="dxa" w:w="2160"/>
-          </w:tcPr>
-          <w:p>
-            <w:r>
-              <w:rPr>
-                <w:sz w:val="18"/>
-              </w:rPr>
-              <w:t>0.995</w:t>
-            </w:r>
-          </w:p>
-        </w:tc>
-        <w:tc>
-          <w:tcPr>
-            <w:tcW w:type="dxa" w:w="2160"/>
-          </w:tcPr>
-          <w:p>
-            <w:r>
-              <w:rPr>
-                <w:sz w:val="18"/>
-              </w:rPr>
-              <w:t>0.976</w:t>
-            </w:r>
-          </w:p>
-        </w:tc>
-      </w:tr>
-      <w:tr>
-        <w:tc>
-          <w:tcPr>
-            <w:tcW w:type="dxa" w:w="2160"/>
-          </w:tcPr>
-          <w:p>
-            <w:r>
-              <w:rPr>
-                <w:sz w:val="18"/>
-              </w:rPr>
-              <w:t>Overall AP</w:t>
-            </w:r>
-          </w:p>
-        </w:tc>
-        <w:tc>
-          <w:tcPr>
-            <w:tcW w:type="dxa" w:w="2160"/>
-          </w:tcPr>
-          <w:p>
-            <w:r>
-              <w:rPr>
-                <w:sz w:val="18"/>
-              </w:rPr>
-            </w:r>
-          </w:p>
-        </w:tc>
-        <w:tc>
-          <w:tcPr>
-            <w:tcW w:type="dxa" w:w="2160"/>
-          </w:tcPr>
-          <w:p>
-            <w:r>
-              <w:rPr>
-                <w:sz w:val="18"/>
-              </w:rPr>
-              <w:t>0.9841</w:t>
-            </w:r>
-          </w:p>
-        </w:tc>
-        <w:tc>
-          <w:tcPr>
-            <w:tcW w:type="dxa" w:w="2160"/>
-          </w:tcPr>
-          <w:p>
-            <w:r>
-              <w:rPr>
-                <w:sz w:val="18"/>
-              </w:rPr>
-              <w:t>0.9085</w:t>
-            </w:r>
-          </w:p>
-        </w:tc>
-      </w:tr>
-      <w:tr>
-        <w:tc>
-          <w:tcPr>
-            <w:tcW w:type="dxa" w:w="2160"/>
-          </w:tcPr>
-          <w:p>
-            <w:r>
-              <w:rPr>
-                <w:sz w:val="18"/>
-              </w:rPr>
-              <w:t>Overall Accuracy</w:t>
-            </w:r>
-          </w:p>
-        </w:tc>
-        <w:tc>
-          <w:tcPr>
-            <w:tcW w:type="dxa" w:w="2160"/>
-          </w:tcPr>
-          <w:p>
-            <w:r>
-              <w:rPr>
-                <w:sz w:val="18"/>
-              </w:rPr>
-            </w:r>
-          </w:p>
-        </w:tc>
-        <w:tc>
-          <w:tcPr>
-            <w:tcW w:type="dxa" w:w="2160"/>
-          </w:tcPr>
-          <w:p>
-            <w:r>
-              <w:rPr>
-                <w:sz w:val="18"/>
-              </w:rPr>
-              <w:t>0.940</w:t>
-            </w:r>
-          </w:p>
-        </w:tc>
-        <w:tc>
-          <w:tcPr>
-            <w:tcW w:type="dxa" w:w="2160"/>
-          </w:tcPr>
-          <w:p>
-            <w:r>
-              <w:rPr>
-                <w:sz w:val="18"/>
-              </w:rPr>
-              <w:t>0.834</w:t>
-            </w:r>
-          </w:p>
-        </w:tc>
-      </w:tr>
-      <w:tr>
-        <w:tc>
-          <w:tcPr>
-            <w:tcW w:type="dxa" w:w="2160"/>
-          </w:tcPr>
-          <w:p>
-            <w:r>
-              <w:rPr>
-                <w:sz w:val="18"/>
-              </w:rPr>
-              <w:t>Std-dev AP</w:t>
-            </w:r>
-          </w:p>
-        </w:tc>
-        <w:tc>
-          <w:tcPr>
-            <w:tcW w:type="dxa" w:w="2160"/>
-          </w:tcPr>
-          <w:p>
-            <w:r>
-              <w:rPr>
-                <w:sz w:val="18"/>
-              </w:rPr>
-            </w:r>
-          </w:p>
-        </w:tc>
-        <w:tc>
-          <w:tcPr>
-            <w:tcW w:type="dxa" w:w="2160"/>
-          </w:tcPr>
-          <w:p>
-            <w:r>
-              <w:rPr>
-                <w:sz w:val="18"/>
-              </w:rPr>
-              <w:t>0.011</w:t>
-            </w:r>
-          </w:p>
-        </w:tc>
-        <w:tc>
-          <w:tcPr>
-            <w:tcW w:type="dxa" w:w="2160"/>
-          </w:tcPr>
-          <w:p>
-            <w:r>
-              <w:rPr>
-                <w:sz w:val="18"/>
-              </w:rPr>
-              <w:t>0.061</w:t>
-            </w:r>
-          </w:p>
-        </w:tc>
-      </w:tr>
-    </w:tbl>
-    <w:p/>
-    <w:p>
-      <w:pPr>
-        <w:pStyle w:val="Heading2"/>
-      </w:pPr>
-      <w:r>
-        <w:t>Notes / Honest Limitations</w:t>
-      </w:r>
-    </w:p>
-    <w:p>
-      <w:pPr>
-        <w:pStyle w:val="ListBullet"/>
-      </w:pPr>
-      <w:r>
-        <w:t>Classes 3 (AI-Text) and 4 (Fully-Fabricated) are near-perfect (F1 ≈ 0.99); the Qwen2 text branch isolates AI-written text cleanly.</w:t>
-      </w:r>
-    </w:p>
-    <w:p>
-      <w:pPr>
-        <w:pStyle w:val="ListBullet"/>
-      </w:pPr>
-      <w:r>
-        <w:t>The error mass is in Real ↔ Out-of-Context (linear-probe AUC ≈ 0.51, at-chance) — a frozen-FND-CLIP / data-scale ceiling, not a fusion bug.</w:t>
-      </w:r>
-    </w:p>
-    <w:p>
-      <w:pPr>
-        <w:pStyle w:val="ListBullet"/>
-      </w:pPr>
-      <w:r>
-        <w:t>A1 (RGB+Fourier) is the recommended forensic detector; A2 (DCT) is the weaker frequency-domain baseline (notably on MidJourney/VQDM).</w:t>
       </w:r>
     </w:p>
     <w:sectPr>

</xml_diff>